<commit_message>
chore: cleanup legacy scripts, untrack .brain, add CCT/BBLV bulk export & templates
</commit_message>
<xml_diff>
--- a/templates/PHU_LUC_GIAM_GIA_CSHT.docx
+++ b/templates/PHU_LUC_GIAM_GIA_CSHT.docx
@@ -1,6 +1,6 @@
 
 <file path=word/document.xml><?xml version="1.0" encoding="utf-8"?>
-<w:document xmlns:wpc="http://schemas.microsoft.com/office/word/2010/wordprocessingCanvas" xmlns:cx="http://schemas.microsoft.com/office/drawing/2014/chartex" xmlns:cx1="http://schemas.microsoft.com/office/drawing/2015/9/8/chartex" xmlns:cx2="http://schemas.microsoft.com/office/drawing/2015/10/21/chartex" xmlns:cx3="http://schemas.microsoft.com/office/drawing/2016/5/9/chartex" xmlns:cx4="http://schemas.microsoft.com/office/drawing/2016/5/10/chartex" xmlns:cx5="http://schemas.microsoft.com/office/drawing/2016/5/11/chartex" xmlns:cx6="http://schemas.microsoft.com/office/drawing/2016/5/12/chartex" xmlns:cx7="http://schemas.microsoft.com/office/drawing/2016/5/13/chartex" xmlns:cx8="http://schemas.microsoft.com/office/drawing/2016/5/14/chartex" xmlns:mc="http://schemas.openxmlformats.org/markup-compatibility/2006" xmlns:aink="http://schemas.microsoft.com/office/drawing/2016/ink" xmlns:am3d="http://schemas.microsoft.com/office/drawing/2017/model3d" xmlns:o="urn:schemas-microsoft-com:office:office" xmlns:r="http://schemas.openxmlformats.org/officeDocument/2006/relationships" xmlns:m="http://schemas.openxmlformats.org/officeDocument/2006/math" xmlns:v="urn:schemas-microsoft-com:vml" xmlns:wp14="http://schemas.microsoft.com/office/word/2010/wordprocessingDrawing" xmlns:wp="http://schemas.openxmlformats.org/drawingml/2006/wordprocessingDrawing" xmlns:w10="urn:schemas-microsoft-com:office:word" xmlns:w="http://schemas.openxmlformats.org/wordprocessingml/2006/main" xmlns:w14="http://schemas.microsoft.com/office/word/2010/wordml" xmlns:w15="http://schemas.microsoft.com/office/word/2012/wordml" xmlns:w16cid="http://schemas.microsoft.com/office/word/2016/wordml/cid" xmlns:w16se="http://schemas.microsoft.com/office/word/2015/wordml/symex" xmlns:wpg="http://schemas.microsoft.com/office/word/2010/wordprocessingGroup" xmlns:wpi="http://schemas.microsoft.com/office/word/2010/wordprocessingInk" xmlns:wne="http://schemas.microsoft.com/office/word/2006/wordml" xmlns:wps="http://schemas.microsoft.com/office/word/2010/wordprocessingShape" mc:Ignorable="w14 w15 w16se w16cid wp14">
+<w:document xmlns:wpc="http://schemas.microsoft.com/office/word/2010/wordprocessingCanvas" xmlns:cx="http://schemas.microsoft.com/office/drawing/2014/chartex" xmlns:cx1="http://schemas.microsoft.com/office/drawing/2015/9/8/chartex" xmlns:cx2="http://schemas.microsoft.com/office/drawing/2015/10/21/chartex" xmlns:cx3="http://schemas.microsoft.com/office/drawing/2016/5/9/chartex" xmlns:cx4="http://schemas.microsoft.com/office/drawing/2016/5/10/chartex" xmlns:cx5="http://schemas.microsoft.com/office/drawing/2016/5/11/chartex" xmlns:cx6="http://schemas.microsoft.com/office/drawing/2016/5/12/chartex" xmlns:cx7="http://schemas.microsoft.com/office/drawing/2016/5/13/chartex" xmlns:cx8="http://schemas.microsoft.com/office/drawing/2016/5/14/chartex" xmlns:mc="http://schemas.openxmlformats.org/markup-compatibility/2006" xmlns:aink="http://schemas.microsoft.com/office/drawing/2016/ink" xmlns:am3d="http://schemas.microsoft.com/office/drawing/2017/model3d" xmlns:o="urn:schemas-microsoft-com:office:office" xmlns:oel="http://schemas.microsoft.com/office/2019/extlst" xmlns:r="http://schemas.openxmlformats.org/officeDocument/2006/relationships" xmlns:m="http://schemas.openxmlformats.org/officeDocument/2006/math" xmlns:v="urn:schemas-microsoft-com:vml" xmlns:wp14="http://schemas.microsoft.com/office/word/2010/wordprocessingDrawing" xmlns:wp="http://schemas.openxmlformats.org/drawingml/2006/wordprocessingDrawing" xmlns:w10="urn:schemas-microsoft-com:office:word" xmlns:w="http://schemas.openxmlformats.org/wordprocessingml/2006/main" xmlns:w14="http://schemas.microsoft.com/office/word/2010/wordml" xmlns:w15="http://schemas.microsoft.com/office/word/2012/wordml" xmlns:w16cex="http://schemas.microsoft.com/office/word/2018/wordml/cex" xmlns:w16cid="http://schemas.microsoft.com/office/word/2016/wordml/cid" xmlns:w16="http://schemas.microsoft.com/office/word/2018/wordml" xmlns:w16du="http://schemas.microsoft.com/office/word/2023/wordml/word16du" xmlns:w16sdtdh="http://schemas.microsoft.com/office/word/2020/wordml/sdtdatahash" xmlns:w16sdtfl="http://schemas.microsoft.com/office/word/2024/wordml/sdtformatlock" xmlns:w16se="http://schemas.microsoft.com/office/word/2015/wordml/symex" xmlns:wpg="http://schemas.microsoft.com/office/word/2010/wordprocessingGroup" xmlns:wpi="http://schemas.microsoft.com/office/word/2010/wordprocessingInk" xmlns:wne="http://schemas.microsoft.com/office/word/2006/wordml" xmlns:wps="http://schemas.microsoft.com/office/word/2010/wordprocessingShape" mc:Ignorable="w14 w15 w16se w16cid w16 w16cex w16sdtdh w16sdtfl w16du wp14">
   <w:body>
     <w:tbl>
       <w:tblPr>
@@ -33,7 +33,6 @@
             <w:r>
               <w:rPr>
                 <w:rFonts w:ascii="Times New Roman" w:hAnsi="Times New Roman"/>
-                <w:sz w:val="26"/>
                 <w:szCs w:val="26"/>
               </w:rPr>
               <w:t>MOBIFONE ĐỒNG NAI</w:t>
@@ -51,7 +50,6 @@
               <w:rPr>
                 <w:rFonts w:ascii="Times New Roman" w:hAnsi="Times New Roman"/>
                 <w:b/>
-                <w:sz w:val="26"/>
                 <w:szCs w:val="26"/>
               </w:rPr>
               <w:t>PHÒNG VIỄN THÔNG</w:t>
@@ -76,7 +74,6 @@
               <w:rPr>
                 <w:rFonts w:ascii="Times New Roman" w:hAnsi="Times New Roman"/>
                 <w:b/>
-                <w:sz w:val="26"/>
                 <w:szCs w:val="28"/>
               </w:rPr>
               <w:t>CỘNG HOÀ XÃ HỘI CHỦ NGHĨA VIỆT NAM</w:t>
@@ -95,7 +92,6 @@
               <w:rPr>
                 <w:rFonts w:ascii="Times New Roman" w:hAnsi="Times New Roman"/>
                 <w:b/>
-                <w:sz w:val="26"/>
                 <w:szCs w:val="28"/>
               </w:rPr>
               <w:t>Độc lập - Tự do - Hạnh phúc</w:t>
@@ -126,7 +122,6 @@
                 <w:rFonts w:ascii="Times New Roman" w:hAnsi="Times New Roman"/>
                 <w:b/>
                 <w:noProof/>
-                <w:sz w:val="26"/>
                 <w:szCs w:val="26"/>
               </w:rPr>
               <mc:AlternateContent>
@@ -184,9 +179,9 @@
                     </wp:anchor>
                   </w:drawing>
                 </mc:Choice>
-                <mc:Fallback xmlns:oel="http://schemas.microsoft.com/office/2019/extlst" xmlns:w16cex="http://schemas.microsoft.com/office/word/2018/wordml/cex" xmlns:w16="http://schemas.microsoft.com/office/word/2018/wordml" xmlns:w16du="http://schemas.microsoft.com/office/word/2023/wordml/word16du" xmlns:w16sdtdh="http://schemas.microsoft.com/office/word/2020/wordml/sdtdatahash" xmlns:w16sdtfl="http://schemas.microsoft.com/office/word/2024/wordml/sdtformatlock">
+                <mc:Fallback xmlns:a="http://schemas.openxmlformats.org/drawingml/2006/main" xmlns:pic="http://schemas.openxmlformats.org/drawingml/2006/picture" xmlns:a14="http://schemas.microsoft.com/office/drawing/2010/main" xmlns:w16cei="http://schemas.microsoft.com/office/word/2026/wordml/cei">
                   <w:pict>
-                    <v:line w14:anchorId="1B35A85B" id="Straight Connector 2000649774" o:spid="_x0000_s1026" style="position:absolute;flip:x;z-index:251661312;visibility:visible;mso-wrap-style:square;mso-wrap-distance-left:9pt;mso-wrap-distance-top:0;mso-wrap-distance-right:9pt;mso-wrap-distance-bottom:0;mso-position-horizontal:absolute;mso-position-horizontal-relative:text;mso-position-vertical:absolute;mso-position-vertical-relative:text" from="51.4pt,3.8pt" to="174.3pt,3.8pt" o:gfxdata="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" strokecolor="black [3213]" strokeweight=".5pt">
+                    <v:line id="Straight Connector 2000649774" style="position:absolute;flip:x;z-index:251661312;visibility:visible;mso-wrap-style:square;mso-wrap-distance-left:9pt;mso-wrap-distance-top:0;mso-wrap-distance-right:9pt;mso-wrap-distance-bottom:0;mso-position-horizontal:absolute;mso-position-horizontal-relative:text;mso-position-vertical:absolute;mso-position-vertical-relative:text" o:spid="_x0000_s1026" strokecolor="black [3213]" strokeweight=".5pt" o:gfxdata="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" from="51.4pt,3.8pt" to="174.3pt,3.8pt" w14:anchorId="1B35A85B">
                       <v:stroke joinstyle="miter"/>
                     </v:line>
                   </w:pict>
@@ -213,7 +208,6 @@
                 <w:rFonts w:ascii="Times New Roman" w:hAnsi="Times New Roman"/>
                 <w:b/>
                 <w:noProof/>
-                <w:sz w:val="26"/>
                 <w:szCs w:val="26"/>
               </w:rPr>
               <mc:AlternateContent>
@@ -277,9 +271,9 @@
                     </wp:anchor>
                   </w:drawing>
                 </mc:Choice>
-                <mc:Fallback xmlns:oel="http://schemas.microsoft.com/office/2019/extlst" xmlns:w16cex="http://schemas.microsoft.com/office/word/2018/wordml/cex" xmlns:w16="http://schemas.microsoft.com/office/word/2018/wordml" xmlns:w16du="http://schemas.microsoft.com/office/word/2023/wordml/word16du" xmlns:w16sdtdh="http://schemas.microsoft.com/office/word/2020/wordml/sdtdatahash" xmlns:w16sdtfl="http://schemas.microsoft.com/office/word/2024/wordml/sdtformatlock">
+                <mc:Fallback xmlns:a="http://schemas.openxmlformats.org/drawingml/2006/main" xmlns:pic="http://schemas.openxmlformats.org/drawingml/2006/picture" xmlns:a14="http://schemas.microsoft.com/office/drawing/2010/main" xmlns:w16cei="http://schemas.microsoft.com/office/word/2026/wordml/cei">
                   <w:pict>
-                    <v:line w14:anchorId="5A9A1170" id="Straight Connector 1463436238" o:spid="_x0000_s1026" style="position:absolute;flip:y;z-index:251660288;visibility:visible;mso-wrap-style:square;mso-width-percent:0;mso-height-percent:0;mso-wrap-distance-left:9pt;mso-wrap-distance-top:0;mso-wrap-distance-right:9pt;mso-wrap-distance-bottom:0;mso-position-horizontal:absolute;mso-position-horizontal-relative:text;mso-position-vertical:absolute;mso-position-vertical-relative:text;mso-width-percent:0;mso-height-percent:0;mso-width-relative:margin;mso-height-relative:margin" from="66.8pt,5.25pt" to="223.7pt,5.25pt" o:gfxdata="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" strokecolor="black [3213]" strokeweight=".5pt">
+                    <v:line id="Straight Connector 1463436238" style="position:absolute;flip:y;z-index:251660288;visibility:visible;mso-wrap-style:square;mso-width-percent:0;mso-height-percent:0;mso-wrap-distance-left:9pt;mso-wrap-distance-top:0;mso-wrap-distance-right:9pt;mso-wrap-distance-bottom:0;mso-position-horizontal:absolute;mso-position-horizontal-relative:text;mso-position-vertical:absolute;mso-position-vertical-relative:text;mso-width-percent:0;mso-height-percent:0;mso-width-relative:margin;mso-height-relative:margin" o:spid="_x0000_s1026" strokecolor="black [3213]" strokeweight=".5pt" o:gfxdata="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" from="66.8pt,5.25pt" to="223.7pt,5.25pt" w14:anchorId="5A9A1170">
                       <v:stroke joinstyle="miter"/>
                     </v:line>
                   </w:pict>
@@ -309,10 +303,23 @@
             <w:r>
               <w:rPr>
                 <w:rFonts w:ascii="Times New Roman" w:hAnsi="Times New Roman"/>
-                <w:sz w:val="26"/>
                 <w:szCs w:val="26"/>
               </w:rPr>
-              <w:t>Số:       /TTr-VT</w:t>
+              <w:t xml:space="preserve">Số: </w:t>
+            </w:r>
+            <w:r>
+              <w:rPr>
+                <w:rFonts w:ascii="Times New Roman" w:hAnsi="Times New Roman"/>
+                <w:szCs w:val="26"/>
+              </w:rPr>
+              <w:t xml:space="preserve">       </w:t>
+            </w:r>
+            <w:r>
+              <w:rPr>
+                <w:rFonts w:ascii="Times New Roman" w:hAnsi="Times New Roman"/>
+                <w:szCs w:val="26"/>
+              </w:rPr>
+              <w:t>/TTr-VT</w:t>
             </w:r>
           </w:p>
         </w:tc>
@@ -334,86 +341,10 @@
               <w:rPr>
                 <w:rFonts w:ascii="Times New Roman" w:hAnsi="Times New Roman"/>
                 <w:i/>
-                <w:sz w:val="26"/>
                 <w:szCs w:val="28"/>
               </w:rPr>
-              <w:t xml:space="preserve">Đồng Nai, ngày  </w:t>
+              <w:t>Đồng Nai, ngày      tháng      năm  2026</w:t>
             </w:r>
-            <w:r>
-              <w:rPr>
-                <w:rFonts w:ascii="Times New Roman" w:hAnsi="Times New Roman"/>
-                <w:i/>
-                <w:sz w:val="26"/>
-                <w:szCs w:val="28"/>
-                <w:lang w:val="vi-VN"/>
-              </w:rPr>
-              <w:t xml:space="preserve"> </w:t>
-            </w:r>
-            <w:r>
-              <w:rPr>
-                <w:rFonts w:ascii="Times New Roman" w:hAnsi="Times New Roman"/>
-                <w:i/>
-                <w:sz w:val="26"/>
-                <w:szCs w:val="28"/>
-              </w:rPr>
-              <w:t xml:space="preserve">  tháng</w:t>
-            </w:r>
-            <w:r>
-              <w:rPr>
-                <w:rFonts w:ascii="Times New Roman" w:hAnsi="Times New Roman"/>
-                <w:i/>
-                <w:sz w:val="26"/>
-                <w:szCs w:val="28"/>
-                <w:lang w:val="vi-VN"/>
-              </w:rPr>
-              <w:t xml:space="preserve"> </w:t>
-            </w:r>
-            <w:r>
-              <w:rPr>
-                <w:rFonts w:ascii="Times New Roman" w:hAnsi="Times New Roman"/>
-                <w:i/>
-                <w:sz w:val="26"/>
-                <w:szCs w:val="28"/>
-              </w:rPr>
-              <w:t xml:space="preserve">    năm 2026</w:t>
-            </w:r>
-          </w:p>
-        </w:tc>
-      </w:tr>
-      <w:tr>
-        <w:trPr>
-          <w:trHeight w:val="443"/>
-          <w:jc w:val="center"/>
-        </w:trPr>
-        <w:tc>
-          <w:tcPr>
-            <w:tcW w:w="4390" w:type="dxa"/>
-          </w:tcPr>
-          <w:p>
-            <w:pPr>
-              <w:jc w:val="center"/>
-              <w:rPr>
-                <w:rFonts w:ascii="Times New Roman" w:hAnsi="Times New Roman"/>
-                <w:sz w:val="2"/>
-                <w:szCs w:val="26"/>
-              </w:rPr>
-            </w:pPr>
-          </w:p>
-        </w:tc>
-        <w:tc>
-          <w:tcPr>
-            <w:tcW w:w="6237" w:type="dxa"/>
-          </w:tcPr>
-          <w:p>
-            <w:pPr>
-              <w:jc w:val="right"/>
-              <w:rPr>
-                <w:rFonts w:ascii="Times New Roman" w:hAnsi="Times New Roman"/>
-                <w:i/>
-                <w:sz w:val="4"/>
-                <w:szCs w:val="26"/>
-              </w:rPr>
-            </w:pPr>
           </w:p>
         </w:tc>
       </w:tr>
@@ -433,7 +364,6 @@
         <w:rPr>
           <w:rFonts w:ascii="Times New Roman" w:hAnsi="Times New Roman"/>
           <w:b/>
-          <w:sz w:val="26"/>
           <w:szCs w:val="28"/>
           <w:lang w:val="sv-SE"/>
         </w:rPr>
@@ -446,6 +376,7 @@
         <w:jc w:val="center"/>
         <w:rPr>
           <w:rFonts w:ascii="Times New Roman" w:hAnsi="Times New Roman"/>
+          <w:b/>
           <w:bCs/>
           <w:sz w:val="28"/>
           <w:szCs w:val="28"/>
@@ -454,9 +385,34 @@
       <w:r>
         <w:rPr>
           <w:rFonts w:ascii="Times New Roman" w:hAnsi="Times New Roman"/>
-          <w:sz w:val="26"/>
-        </w:rPr>
-        <w:t>Về việc điều chỉnh giá thuê hợp đồng trạm {{SITE_ID}}</w:t>
+          <w:b/>
+          <w:bCs/>
+        </w:rPr>
+        <w:t xml:space="preserve">Về việc </w:t>
+      </w:r>
+      <w:r>
+        <w:rPr>
+          <w:rFonts w:ascii="Times New Roman" w:hAnsi="Times New Roman"/>
+          <w:b/>
+          <w:bCs/>
+        </w:rPr>
+        <w:t>{{LY_DO}}</w:t>
+      </w:r>
+      <w:r>
+        <w:rPr>
+          <w:rFonts w:ascii="Times New Roman" w:hAnsi="Times New Roman"/>
+          <w:b/>
+          <w:bCs/>
+        </w:rPr>
+        <w:t xml:space="preserve"> </w:t>
+      </w:r>
+      <w:r>
+        <w:rPr>
+          <w:rFonts w:ascii="Times New Roman" w:hAnsi="Times New Roman"/>
+          <w:b/>
+          <w:bCs/>
+        </w:rPr>
+        <w:t>hợp đồng trạm {{SITE_ID}}</w:t>
       </w:r>
     </w:p>
     <w:p>
@@ -473,7 +429,6 @@
           <w:b/>
           <w:bCs/>
           <w:noProof/>
-          <w:sz w:val="26"/>
           <w:szCs w:val="25"/>
         </w:rPr>
         <w:drawing>
@@ -556,7 +511,6 @@
           <w:rFonts w:ascii="Times New Roman" w:hAnsi="Times New Roman"/>
           <w:i w:val="0"/>
           <w:iCs w:val="0"/>
-          <w:sz w:val="26"/>
           <w:szCs w:val="28"/>
         </w:rPr>
         <w:t>Kính trình</w:t>
@@ -567,7 +521,6 @@
           <w:rFonts w:ascii="Times New Roman" w:hAnsi="Times New Roman"/>
           <w:i w:val="0"/>
           <w:iCs w:val="0"/>
-          <w:sz w:val="26"/>
           <w:szCs w:val="26"/>
         </w:rPr>
         <w:t xml:space="preserve">: </w:t>
@@ -575,7 +528,6 @@
       <w:r>
         <w:rPr>
           <w:rFonts w:ascii="Times New Roman" w:hAnsi="Times New Roman"/>
-          <w:sz w:val="26"/>
           <w:szCs w:val="28"/>
         </w:rPr>
         <w:t>Ông Nguyễn Thanh Lâm – Phó Giám đốc MobiFone Đồng Nai</w:t>
@@ -599,7 +551,6 @@
         <w:rPr>
           <w:rFonts w:ascii="Times New Roman" w:hAnsi="Times New Roman"/>
           <w:b/>
-          <w:sz w:val="26"/>
           <w:szCs w:val="26"/>
         </w:rPr>
         <w:t>Ý kiến chỉ đạo của Lãnh đạo MobiFone Đồng Nai</w:t>
@@ -622,7 +573,6 @@
       <w:r>
         <w:rPr>
           <w:rFonts w:ascii="Times New Roman" w:hAnsi="Times New Roman"/>
-          <w:sz w:val="26"/>
         </w:rPr>
         <w:t> </w:t>
       </w:r>
@@ -644,7 +594,6 @@
       <w:r>
         <w:rPr>
           <w:rFonts w:ascii="Times New Roman" w:hAnsi="Times New Roman"/>
-          <w:sz w:val="26"/>
           <w:szCs w:val="28"/>
           <w:lang w:val="sv-SE"/>
         </w:rPr>
@@ -665,42 +614,48 @@
           <w:rFonts w:ascii="Times New Roman" w:hAnsi="Times New Roman"/>
         </w:rPr>
       </w:pPr>
+      <w:r>
+        <w:rPr>
+          <w:rFonts w:ascii="Times New Roman" w:hAnsi="Times New Roman"/>
+        </w:rPr>
+        <w:t> </w:t>
+      </w:r>
     </w:p>
     <w:p>
       <w:pPr>
-        <w:pBdr>
-          <w:top w:val="single" w:sz="4" w:space="1" w:color="auto"/>
-          <w:left w:val="single" w:sz="4" w:space="4" w:color="auto"/>
-          <w:bottom w:val="single" w:sz="4" w:space="0" w:color="auto"/>
-          <w:right w:val="single" w:sz="4" w:space="0" w:color="auto"/>
-        </w:pBdr>
-        <w:spacing w:before="120" w:line="360" w:lineRule="exact"/>
-        <w:jc w:val="center"/>
-        <w:rPr>
-          <w:rFonts w:ascii="Times New Roman" w:hAnsi="Times New Roman"/>
-        </w:rPr>
-      </w:pPr>
-    </w:p>
-    <w:p>
-      <w:pPr>
-        <w:pBdr>
-          <w:top w:val="single" w:sz="4" w:space="1" w:color="auto"/>
-          <w:left w:val="single" w:sz="4" w:space="4" w:color="auto"/>
-          <w:bottom w:val="single" w:sz="4" w:space="0" w:color="auto"/>
-          <w:right w:val="single" w:sz="4" w:space="0" w:color="auto"/>
-        </w:pBdr>
-        <w:spacing w:before="120" w:line="360" w:lineRule="exact"/>
-        <w:jc w:val="center"/>
-        <w:rPr>
-          <w:rFonts w:ascii="Times New Roman" w:hAnsi="Times New Roman"/>
-        </w:rPr>
-      </w:pPr>
-      <w:r>
-        <w:rPr>
-          <w:rFonts w:ascii="Times New Roman" w:hAnsi="Times New Roman"/>
-          <w:sz w:val="26"/>
-        </w:rPr>
-        <w:t> </w:t>
+        <w:spacing w:before="120" w:line="320" w:lineRule="exact"/>
+        <w:ind w:firstLine="720"/>
+        <w:jc w:val="both"/>
+        <w:rPr>
+          <w:rFonts w:ascii="Times New Roman" w:hAnsi="Times New Roman"/>
+          <w:bCs/>
+          <w:noProof/>
+          <w:szCs w:val="26"/>
+        </w:rPr>
+      </w:pPr>
+      <w:r>
+        <w:rPr>
+          <w:rFonts w:ascii="Times New Roman" w:hAnsi="Times New Roman"/>
+          <w:bCs/>
+          <w:szCs w:val="26"/>
+        </w:rPr>
+        <w:t>Căn cứ hợp đồng số {{CONTRACT_NO}} ký ngày {{CONTRACT_DATE}} giữa Trung tâm Mạng lưới MobiFone miền Nam</w:t>
+      </w:r>
+      <w:r>
+        <w:rPr>
+          <w:rFonts w:ascii="Times New Roman" w:hAnsi="Times New Roman"/>
+          <w:bCs/>
+          <w:szCs w:val="26"/>
+        </w:rPr>
+        <w:t xml:space="preserve"> ( nay MobiFone Đồng Nai tiếp quản) </w:t>
+      </w:r>
+      <w:r>
+        <w:rPr>
+          <w:rFonts w:ascii="Times New Roman" w:hAnsi="Times New Roman"/>
+          <w:bCs/>
+          <w:szCs w:val="26"/>
+        </w:rPr>
+        <w:t>và Ông/Bà {{OWNER_NAME}} về việc thuê đặt trạm BTS địa chỉ: {{ADDRESS_OLD}} ({{ADDRESS_NEW}}).</w:t>
       </w:r>
     </w:p>
     <w:p>
@@ -712,18 +667,18 @@
           <w:rStyle w:val="Emphasis"/>
           <w:rFonts w:ascii="Times New Roman" w:hAnsi="Times New Roman"/>
           <w:i w:val="0"/>
-          <w:noProof/>
           <w:sz w:val="28"/>
           <w:szCs w:val="28"/>
         </w:rPr>
       </w:pPr>
       <w:r>
         <w:rPr>
-          <w:rFonts w:ascii="Times New Roman" w:hAnsi="Times New Roman"/>
-          <w:b/>
-          <w:sz w:val="26"/>
-        </w:rPr>
-        <w:t>Căn cứ hợp đồng số {{CONTRACT_NO}} ký ngày {{CONTRACT_DATE}} giữa Trung tâm Mạng lưới MobiFone miền Nam và Ông/Bà {{OWNER_NAME}} về việc thuê đặt trạm BTS địa chỉ: {{ADDRESS_OLD}} ({{ADDRESS_NEW}}).</w:t>
+          <w:rStyle w:val="Emphasis"/>
+          <w:rFonts w:ascii="Times New Roman" w:hAnsi="Times New Roman"/>
+          <w:i w:val="0"/>
+          <w:szCs w:val="28"/>
+        </w:rPr>
+        <w:t>Căn cứ Quyết định số 02/QĐ-HĐTV ký ngày 17/01/2025 về việc ban hành quy định về đơn giá thuê mặt bằng phát triển mạng lưới thông tin di động;</w:t>
       </w:r>
     </w:p>
     <w:p>
@@ -732,18 +687,29 @@
         <w:ind w:firstLine="720"/>
         <w:jc w:val="both"/>
         <w:rPr>
-          <w:rFonts w:ascii="Times New Roman" w:hAnsi="Times New Roman"/>
-          <w:iCs/>
+          <w:rStyle w:val="Emphasis"/>
+          <w:rFonts w:ascii="Times New Roman" w:hAnsi="Times New Roman"/>
+          <w:i w:val="0"/>
           <w:sz w:val="28"/>
           <w:szCs w:val="28"/>
         </w:rPr>
       </w:pPr>
       <w:r>
         <w:rPr>
-          <w:rFonts w:ascii="Times New Roman" w:hAnsi="Times New Roman"/>
-          <w:sz w:val="26"/>
-        </w:rPr>
-        <w:t>Căn cứ phụ lục hợp đồng kí ngày 01/12/2025 về việc chuyển chủ thể kí hợp đồng từ Trung tâm Mạng lưới MobiFone miền Nam qua MobiFone Đồng Nai của hợp đồng số {{CONTRACT_NO}};</w:t>
+          <w:rStyle w:val="Emphasis"/>
+          <w:rFonts w:ascii="Times New Roman" w:hAnsi="Times New Roman"/>
+          <w:i w:val="0"/>
+          <w:szCs w:val="28"/>
+        </w:rPr>
+        <w:t xml:space="preserve">Căn cứ văn bản 1245/D01-B1-B4 ký ngày 26/02/2026 về việc </w:t>
+      </w:r>
+      <w:r>
+        <w:rPr>
+          <w:rFonts w:ascii="Times New Roman" w:hAnsi="Times New Roman"/>
+          <w:iCs/>
+          <w:szCs w:val="28"/>
+        </w:rPr>
+        <w:t>triển khai các giải pháp tăng cường trong đàm phán tiết giảm chi phí thuê hạ tầng;</w:t>
       </w:r>
     </w:p>
     <w:p>
@@ -752,62 +718,36 @@
         <w:ind w:firstLine="720"/>
         <w:jc w:val="both"/>
         <w:rPr>
-          <w:rStyle w:val="Emphasis"/>
-          <w:rFonts w:ascii="Times New Roman" w:hAnsi="Times New Roman"/>
-          <w:i w:val="0"/>
+          <w:rFonts w:ascii="Times New Roman" w:hAnsi="Times New Roman"/>
           <w:sz w:val="28"/>
           <w:szCs w:val="28"/>
         </w:rPr>
       </w:pPr>
       <w:r>
         <w:rPr>
-          <w:rStyle w:val="Emphasis"/>
-          <w:rFonts w:ascii="Times New Roman" w:hAnsi="Times New Roman"/>
-          <w:i w:val="0"/>
-          <w:sz w:val="26"/>
-          <w:szCs w:val="28"/>
-        </w:rPr>
-        <w:t>Căn cứ Quyết định số 02/QĐ-HĐTV ký ngày 17/01/2025 về việc ban hành quy định về đ</w:t>
-      </w:r>
-      <w:r>
-        <w:rPr>
-          <w:rStyle w:val="Emphasis"/>
-          <w:rFonts w:ascii="Times New Roman" w:hAnsi="Times New Roman" w:hint="eastAsia"/>
-          <w:i w:val="0"/>
-          <w:sz w:val="26"/>
-          <w:szCs w:val="28"/>
-        </w:rPr>
-        <w:t>ơ</w:t>
-      </w:r>
-      <w:r>
-        <w:rPr>
-          <w:rStyle w:val="Emphasis"/>
-          <w:rFonts w:ascii="Times New Roman" w:hAnsi="Times New Roman"/>
-          <w:i w:val="0"/>
-          <w:sz w:val="26"/>
-          <w:szCs w:val="28"/>
-        </w:rPr>
-        <w:t>n giá thuê mặt bằng phát triển mạng l</w:t>
-      </w:r>
-      <w:r>
-        <w:rPr>
-          <w:rStyle w:val="Emphasis"/>
-          <w:rFonts w:ascii="Times New Roman" w:hAnsi="Times New Roman" w:hint="eastAsia"/>
-          <w:i w:val="0"/>
-          <w:sz w:val="26"/>
-          <w:szCs w:val="28"/>
-        </w:rPr>
-        <w:t>ư</w:t>
-      </w:r>
-      <w:r>
-        <w:rPr>
-          <w:rStyle w:val="Emphasis"/>
-          <w:rFonts w:ascii="Times New Roman" w:hAnsi="Times New Roman"/>
-          <w:i w:val="0"/>
-          <w:sz w:val="26"/>
-          <w:szCs w:val="28"/>
-        </w:rPr>
-        <w:t>ới thông tin di động;</w:t>
+          <w:rFonts w:ascii="Times New Roman" w:hAnsi="Times New Roman"/>
+        </w:rPr>
+        <w:t xml:space="preserve">Căn cứ biên bản làm việc về việc </w:t>
+      </w:r>
+      <w:r>
+        <w:rPr>
+          <w:rFonts w:ascii="Times New Roman" w:hAnsi="Times New Roman"/>
+        </w:rPr>
+        <w:t>{{LY_DO}}</w:t>
+      </w:r>
+      <w:r>
+        <w:rPr>
+          <w:rFonts w:ascii="Times New Roman" w:hAnsi="Times New Roman"/>
+          <w:b/>
+          <w:bCs/>
+        </w:rPr>
+        <w:t xml:space="preserve"> </w:t>
+      </w:r>
+      <w:r>
+        <w:rPr>
+          <w:rFonts w:ascii="Times New Roman" w:hAnsi="Times New Roman"/>
+        </w:rPr>
+        <w:t>hợp đồng thuê trạm {{SITE_ID}}</w:t>
       </w:r>
     </w:p>
     <w:p>
@@ -816,123 +756,65 @@
         <w:ind w:firstLine="720"/>
         <w:jc w:val="both"/>
         <w:rPr>
-          <w:rStyle w:val="Emphasis"/>
-          <w:rFonts w:ascii="Times New Roman" w:hAnsi="Times New Roman"/>
-          <w:i w:val="0"/>
+          <w:rFonts w:ascii="Times New Roman" w:hAnsi="Times New Roman"/>
           <w:sz w:val="28"/>
           <w:szCs w:val="28"/>
-        </w:rPr>
-      </w:pPr>
+          <w:lang w:val="vi-VN"/>
+        </w:rPr>
+      </w:pPr>
+      <w:r>
+        <w:rPr>
+          <w:rFonts w:ascii="Times New Roman" w:hAnsi="Times New Roman"/>
+          <w:szCs w:val="28"/>
+          <w:lang w:val="vi-VN"/>
+        </w:rPr>
+        <w:t xml:space="preserve">Phòng Viễn </w:t>
+      </w:r>
+      <w:r>
+        <w:rPr>
+          <w:rFonts w:ascii="Times New Roman" w:hAnsi="Times New Roman"/>
+          <w:szCs w:val="28"/>
+        </w:rPr>
+        <w:t>t</w:t>
+      </w:r>
+      <w:r>
+        <w:rPr>
+          <w:rFonts w:ascii="Times New Roman" w:hAnsi="Times New Roman"/>
+          <w:szCs w:val="28"/>
+          <w:lang w:val="vi-VN"/>
+        </w:rPr>
+        <w:t xml:space="preserve">hông kính trình Phó Giám đốc </w:t>
+      </w:r>
+      <w:r>
+        <w:rPr>
+          <w:rFonts w:ascii="Times New Roman" w:hAnsi="Times New Roman"/>
+          <w:szCs w:val="28"/>
+        </w:rPr>
+        <w:t>xem</w:t>
+      </w:r>
+      <w:r>
+        <w:rPr>
+          <w:rFonts w:ascii="Times New Roman" w:hAnsi="Times New Roman"/>
+          <w:szCs w:val="28"/>
+          <w:lang w:val="vi-VN"/>
+        </w:rPr>
+        <w:t xml:space="preserve"> xét, phê duyệt ký phụ lục </w:t>
+      </w:r>
       <w:r>
         <w:rPr>
           <w:rStyle w:val="Emphasis"/>
           <w:rFonts w:ascii="Times New Roman" w:hAnsi="Times New Roman"/>
           <w:i w:val="0"/>
-          <w:sz w:val="26"/>
           <w:szCs w:val="28"/>
         </w:rPr>
-        <w:t xml:space="preserve">Căn cứ văn bản 1245/D01-B1-B4 ký ngày 26/02/2026 về việc </w:t>
-      </w:r>
-      <w:r>
-        <w:rPr>
-          <w:rFonts w:ascii="Times New Roman" w:hAnsi="Times New Roman"/>
-          <w:iCs/>
-          <w:sz w:val="26"/>
+        <w:t xml:space="preserve">điều chỉnh </w:t>
+      </w:r>
+      <w:r>
+        <w:rPr>
+          <w:rStyle w:val="Emphasis"/>
+          <w:rFonts w:ascii="Times New Roman" w:hAnsi="Times New Roman"/>
+          <w:i w:val="0"/>
           <w:szCs w:val="28"/>
-        </w:rPr>
-        <w:t>triển khai các giải pháp tăng cường trong đàm phán tiết giảm chi phí thuê hạ tầng;</w:t>
-      </w:r>
-    </w:p>
-    <w:p>
-      <w:pPr>
-        <w:spacing w:before="120" w:line="360" w:lineRule="exact"/>
-        <w:ind w:firstLine="720"/>
-        <w:jc w:val="both"/>
-        <w:rPr>
-          <w:rFonts w:ascii="Times New Roman" w:hAnsi="Times New Roman"/>
-          <w:sz w:val="28"/>
-          <w:szCs w:val="28"/>
-        </w:rPr>
-      </w:pPr>
-      <w:r>
-        <w:rPr>
-          <w:sz w:val="26"/>
-        </w:rPr>
-        <w:t>Căn cứ biên bản làm việc về việc đàm phán giảm giá hợp đồng thuê trạm {{SITE_ID}}</w:t>
-      </w:r>
-    </w:p>
-    <w:p>
-      <w:pPr>
-        <w:spacing w:before="120" w:line="360" w:lineRule="exact"/>
-        <w:ind w:firstLine="720"/>
-        <w:jc w:val="both"/>
-        <w:rPr>
-          <w:rFonts w:ascii="Times New Roman" w:hAnsi="Times New Roman"/>
-          <w:sz w:val="28"/>
-          <w:szCs w:val="28"/>
-          <w:lang w:val="vi-VN"/>
-        </w:rPr>
-      </w:pPr>
-      <w:r>
-        <w:rPr>
-          <w:rFonts w:ascii="Times New Roman" w:hAnsi="Times New Roman"/>
-          <w:sz w:val="26"/>
-          <w:szCs w:val="28"/>
-          <w:lang w:val="vi-VN"/>
-        </w:rPr>
-        <w:t xml:space="preserve">Phòng Viễn </w:t>
-      </w:r>
-      <w:r>
-        <w:rPr>
-          <w:rFonts w:ascii="Times New Roman" w:hAnsi="Times New Roman"/>
-          <w:sz w:val="26"/>
-          <w:szCs w:val="28"/>
-        </w:rPr>
-        <w:t>t</w:t>
-      </w:r>
-      <w:r>
-        <w:rPr>
-          <w:rFonts w:ascii="Times New Roman" w:hAnsi="Times New Roman"/>
-          <w:sz w:val="26"/>
-          <w:szCs w:val="28"/>
-          <w:lang w:val="vi-VN"/>
-        </w:rPr>
-        <w:t xml:space="preserve">hông kính trình Phó Giám đốc </w:t>
-      </w:r>
-      <w:r>
-        <w:rPr>
-          <w:rFonts w:ascii="Times New Roman" w:hAnsi="Times New Roman"/>
-          <w:sz w:val="26"/>
-          <w:szCs w:val="28"/>
-        </w:rPr>
-        <w:t>xem</w:t>
-      </w:r>
-      <w:r>
-        <w:rPr>
-          <w:rFonts w:ascii="Times New Roman" w:hAnsi="Times New Roman"/>
-          <w:sz w:val="26"/>
-          <w:szCs w:val="28"/>
-          <w:lang w:val="vi-VN"/>
-        </w:rPr>
-        <w:t xml:space="preserve"> xét, phê duyệt ký phụ lục </w:t>
-      </w:r>
-      <w:r>
-        <w:rPr>
-          <w:rStyle w:val="Emphasis"/>
-          <w:rFonts w:ascii="Times New Roman" w:hAnsi="Times New Roman"/>
-          <w:i w:val="0"/>
-          <w:sz w:val="26"/>
-          <w:szCs w:val="28"/>
-        </w:rPr>
-        <w:t xml:space="preserve">điều chỉnh </w:t>
-      </w:r>
-      <w:r>
-        <w:rPr>
-          <w:rStyle w:val="Emphasis"/>
-          <w:rFonts w:ascii="Times New Roman" w:hAnsi="Times New Roman"/>
-          <w:i w:val="0"/>
-          <w:sz w:val="26"/>
-          <w:szCs w:val="28"/>
           <w:lang w:val="vi-VN"/>
         </w:rPr>
         <w:t>giá thuê</w:t>
@@ -940,7 +822,6 @@
       <w:r>
         <w:rPr>
           <w:rFonts w:ascii="Times New Roman" w:hAnsi="Times New Roman"/>
-          <w:sz w:val="26"/>
           <w:szCs w:val="28"/>
           <w:lang w:val="vi-VN"/>
         </w:rPr>
@@ -966,7 +847,6 @@
       <w:r>
         <w:rPr>
           <w:rFonts w:ascii="Times New Roman" w:hAnsi="Times New Roman"/>
-          <w:sz w:val="26"/>
         </w:rPr>
         <w:t>Đơn giá thuê trước đàm phán (đồng/tháng): {{OLD_PRICE}} đồng</w:t>
       </w:r>
@@ -989,22 +869,9 @@
       <w:r>
         <w:rPr>
           <w:rFonts w:ascii="Times New Roman" w:hAnsi="Times New Roman"/>
-          <w:sz w:val="26"/>
         </w:rPr>
         <w:t>Đơn giá thuê sau đàm phán (đồng/tháng): {{NEW_PRICE}} đồng</w:t>
       </w:r>
-    </w:p>
-    <w:p>
-      <w:pPr>
-        <w:spacing w:before="120" w:line="360" w:lineRule="exact"/>
-        <w:ind w:firstLine="720"/>
-        <w:jc w:val="both"/>
-        <w:rPr>
-          <w:rFonts w:ascii="Times New Roman" w:hAnsi="Times New Roman"/>
-          <w:sz w:val="28"/>
-          <w:szCs w:val="28"/>
-        </w:rPr>
-      </w:pPr>
     </w:p>
     <w:tbl>
       <w:tblPr>
@@ -1021,12 +888,12 @@
         <w:tblLook w:val="04A0" w:firstRow="1" w:lastRow="0" w:firstColumn="1" w:lastColumn="0" w:noHBand="0" w:noVBand="1"/>
       </w:tblPr>
       <w:tblGrid>
-        <w:gridCol w:w="932"/>
+        <w:gridCol w:w="881"/>
+        <w:gridCol w:w="1886"/>
         <w:gridCol w:w="2014"/>
-        <w:gridCol w:w="2061"/>
         <w:gridCol w:w="2201"/>
-        <w:gridCol w:w="2434"/>
-        <w:gridCol w:w="2014"/>
+        <w:gridCol w:w="2276"/>
+        <w:gridCol w:w="1885"/>
       </w:tblGrid>
       <w:tr>
         <w:trPr>
@@ -1055,11 +922,9 @@
                 <w:rFonts w:ascii="Times New Roman" w:hAnsi="Times New Roman"/>
                 <w:b/>
                 <w:bCs/>
-                <w:sz w:val="26"/>
                 <w:szCs w:val="28"/>
               </w:rPr>
-              <w:lastRenderedPageBreak/>
-              <w:t xml:space="preserve">Hạng mục </w:t>
+              <w:t>Hạng mục</w:t>
             </w:r>
           </w:p>
         </w:tc>
@@ -1085,20 +950,9 @@
                 <w:rFonts w:ascii="Times New Roman" w:hAnsi="Times New Roman"/>
                 <w:b/>
                 <w:bCs/>
-                <w:sz w:val="26"/>
                 <w:szCs w:val="28"/>
               </w:rPr>
               <w:t>Giá quy định theo QĐ 02/QĐ-HĐTV</w:t>
-            </w:r>
-            <w:r>
-              <w:rPr>
-                <w:rFonts w:ascii="Times New Roman" w:hAnsi="Times New Roman"/>
-                <w:b/>
-                <w:bCs/>
-                <w:sz w:val="26"/>
-                <w:szCs w:val="28"/>
-              </w:rPr>
-              <w:t xml:space="preserve"> </w:t>
             </w:r>
           </w:p>
         </w:tc>
@@ -1124,7 +978,6 @@
                 <w:rFonts w:ascii="Times New Roman" w:hAnsi="Times New Roman"/>
                 <w:b/>
                 <w:bCs/>
-                <w:sz w:val="26"/>
                 <w:szCs w:val="28"/>
               </w:rPr>
               <w:t>Giá quy định theo văn bản 1245/D01-B1-B4</w:t>
@@ -1152,10 +1005,9 @@
                 <w:rFonts w:ascii="Times New Roman" w:hAnsi="Times New Roman"/>
                 <w:b/>
                 <w:bCs/>
-                <w:sz w:val="26"/>
                 <w:szCs w:val="28"/>
               </w:rPr>
-              <w:t>Giảm trừ  dùng chung</w:t>
+              <w:t>Giảm trừ dùng chung</w:t>
             </w:r>
           </w:p>
         </w:tc>
@@ -1180,7 +1032,6 @@
                 <w:rFonts w:ascii="Times New Roman" w:hAnsi="Times New Roman"/>
                 <w:b/>
                 <w:bCs/>
-                <w:sz w:val="26"/>
                 <w:szCs w:val="28"/>
               </w:rPr>
               <w:t>Giá thuê</w:t>
@@ -1202,7 +1053,6 @@
                 <w:rFonts w:ascii="Times New Roman" w:hAnsi="Times New Roman"/>
                 <w:b/>
                 <w:bCs/>
-                <w:sz w:val="26"/>
                 <w:szCs w:val="28"/>
               </w:rPr>
               <w:t>(đồng/tháng)</w:t>
@@ -1231,7 +1081,6 @@
                 <w:rFonts w:ascii="Times New Roman" w:hAnsi="Times New Roman"/>
                 <w:b/>
                 <w:bCs/>
-                <w:sz w:val="26"/>
                 <w:szCs w:val="28"/>
               </w:rPr>
               <w:t>Tỷ lệ vượt giá so với quy định</w:t>
@@ -1262,7 +1111,6 @@
             <w:r>
               <w:rPr>
                 <w:rFonts w:ascii="Times New Roman" w:hAnsi="Times New Roman"/>
-                <w:sz w:val="26"/>
                 <w:szCs w:val="28"/>
               </w:rPr>
               <w:t>Mặt bằng</w:t>
@@ -1275,10 +1123,15 @@
             <w:vAlign w:val="center"/>
           </w:tcPr>
           <w:p>
+            <w:pPr>
+              <w:jc w:val="center"/>
+              <w:rPr>
+                <w:rFonts w:ascii="Times New Roman" w:hAnsi="Times New Roman"/>
+              </w:rPr>
+            </w:pPr>
             <w:r>
               <w:rPr>
                 <w:rFonts w:ascii="Times New Roman" w:hAnsi="Times New Roman"/>
-                <w:sz w:val="26"/>
               </w:rPr>
               <w:t>{{MB_QĐ02}}</w:t>
             </w:r>
@@ -1308,7 +1161,7 @@
           </w:tcPr>
           <w:p>
             <w:pPr>
-              <w:jc w:val="right"/>
+              <w:jc w:val="center"/>
               <w:rPr>
                 <w:rFonts w:ascii="Times New Roman" w:hAnsi="Times New Roman"/>
                 <w:sz w:val="28"/>
@@ -1323,9 +1176,15 @@
             <w:vAlign w:val="center"/>
           </w:tcPr>
           <w:p>
+            <w:pPr>
+              <w:jc w:val="center"/>
+              <w:rPr>
+                <w:rFonts w:ascii="Times New Roman" w:hAnsi="Times New Roman"/>
+              </w:rPr>
+            </w:pPr>
             <w:r>
               <w:rPr>
-                <w:sz w:val="26"/>
+                <w:rFonts w:ascii="Times New Roman" w:hAnsi="Times New Roman"/>
               </w:rPr>
               <w:t>{{P_MB}}</w:t>
             </w:r>
@@ -1338,9 +1197,15 @@
             <w:hideMark/>
           </w:tcPr>
           <w:p>
+            <w:pPr>
+              <w:jc w:val="center"/>
+              <w:rPr>
+                <w:rFonts w:ascii="Times New Roman" w:hAnsi="Times New Roman"/>
+              </w:rPr>
+            </w:pPr>
             <w:r>
               <w:rPr>
-                <w:sz w:val="26"/>
+                <w:rFonts w:ascii="Times New Roman" w:hAnsi="Times New Roman"/>
               </w:rPr>
               <w:t>{{TL_MB}}</w:t>
             </w:r>
@@ -1370,7 +1235,6 @@
             <w:r>
               <w:rPr>
                 <w:rFonts w:ascii="Times New Roman" w:hAnsi="Times New Roman"/>
-                <w:sz w:val="26"/>
                 <w:szCs w:val="28"/>
               </w:rPr>
               <w:t>Phòng MFĐ</w:t>
@@ -1400,10 +1264,15 @@
             <w:vAlign w:val="center"/>
           </w:tcPr>
           <w:p>
+            <w:pPr>
+              <w:jc w:val="center"/>
+              <w:rPr>
+                <w:rFonts w:ascii="Times New Roman" w:hAnsi="Times New Roman"/>
+              </w:rPr>
+            </w:pPr>
             <w:r>
               <w:rPr>
                 <w:rFonts w:ascii="Times New Roman" w:hAnsi="Times New Roman"/>
-                <w:sz w:val="26"/>
               </w:rPr>
               <w:t>{{MFĐ_1245}}</w:t>
             </w:r>
@@ -1416,7 +1285,7 @@
           </w:tcPr>
           <w:p>
             <w:pPr>
-              <w:jc w:val="right"/>
+              <w:jc w:val="center"/>
               <w:rPr>
                 <w:rFonts w:ascii="Times New Roman" w:hAnsi="Times New Roman"/>
                 <w:sz w:val="28"/>
@@ -1431,9 +1300,15 @@
             <w:vAlign w:val="center"/>
           </w:tcPr>
           <w:p>
+            <w:pPr>
+              <w:jc w:val="center"/>
+              <w:rPr>
+                <w:rFonts w:ascii="Times New Roman" w:hAnsi="Times New Roman"/>
+              </w:rPr>
+            </w:pPr>
             <w:r>
               <w:rPr>
-                <w:sz w:val="26"/>
+                <w:rFonts w:ascii="Times New Roman" w:hAnsi="Times New Roman"/>
               </w:rPr>
               <w:t>{{P_MFD}}</w:t>
             </w:r>
@@ -1446,9 +1321,15 @@
             <w:hideMark/>
           </w:tcPr>
           <w:p>
+            <w:pPr>
+              <w:jc w:val="center"/>
+              <w:rPr>
+                <w:rFonts w:ascii="Times New Roman" w:hAnsi="Times New Roman"/>
+              </w:rPr>
+            </w:pPr>
             <w:r>
               <w:rPr>
-                <w:sz w:val="26"/>
+                <w:rFonts w:ascii="Times New Roman" w:hAnsi="Times New Roman"/>
               </w:rPr>
               <w:t>{{TL_MFD}}</w:t>
             </w:r>
@@ -1478,10 +1359,9 @@
             <w:r>
               <w:rPr>
                 <w:rFonts w:ascii="Times New Roman" w:hAnsi="Times New Roman"/>
-                <w:sz w:val="26"/>
                 <w:szCs w:val="28"/>
               </w:rPr>
-              <w:t>Mặt bằng</w:t>
+              <w:t>Cột anten &gt;35m</w:t>
             </w:r>
           </w:p>
         </w:tc>
@@ -1491,13 +1371,12 @@
             <w:vAlign w:val="center"/>
           </w:tcPr>
           <w:p>
-            <w:r>
-              <w:rPr>
-                <w:rFonts w:ascii="Times New Roman" w:hAnsi="Times New Roman"/>
-                <w:sz w:val="26"/>
-              </w:rPr>
-              <w:t>{{MB_QĐ02}}</w:t>
-            </w:r>
+            <w:pPr>
+              <w:jc w:val="center"/>
+              <w:rPr>
+                <w:rFonts w:ascii="Times New Roman" w:hAnsi="Times New Roman"/>
+              </w:rPr>
+            </w:pPr>
           </w:p>
         </w:tc>
         <w:tc>
@@ -1515,6 +1394,14 @@
                 <w:szCs w:val="28"/>
               </w:rPr>
             </w:pPr>
+            <w:r>
+              <w:rPr>
+                <w:rFonts w:ascii="Times New Roman" w:hAnsi="Times New Roman"/>
+                <w:sz w:val="28"/>
+                <w:szCs w:val="28"/>
+              </w:rPr>
+              <w:t>{{COT_1245}}</w:t>
+            </w:r>
           </w:p>
         </w:tc>
         <w:tc>
@@ -1524,13 +1411,21 @@
           </w:tcPr>
           <w:p>
             <w:pPr>
-              <w:jc w:val="right"/>
+              <w:jc w:val="center"/>
               <w:rPr>
                 <w:rFonts w:ascii="Times New Roman" w:hAnsi="Times New Roman"/>
                 <w:sz w:val="28"/>
                 <w:szCs w:val="28"/>
               </w:rPr>
             </w:pPr>
+            <w:r>
+              <w:rPr>
+                <w:rFonts w:ascii="Times New Roman" w:hAnsi="Times New Roman"/>
+                <w:sz w:val="28"/>
+                <w:szCs w:val="28"/>
+              </w:rPr>
+              <w:t>{{GIAM_TRU}}</w:t>
+            </w:r>
           </w:p>
         </w:tc>
         <w:tc>
@@ -1539,11 +1434,17 @@
             <w:vAlign w:val="center"/>
           </w:tcPr>
           <w:p>
+            <w:pPr>
+              <w:jc w:val="center"/>
+              <w:rPr>
+                <w:rFonts w:ascii="Times New Roman" w:hAnsi="Times New Roman"/>
+              </w:rPr>
+            </w:pPr>
             <w:r>
               <w:rPr>
-                <w:sz w:val="26"/>
-              </w:rPr>
-              <w:t>{{P_MB}}</w:t>
+                <w:rFonts w:ascii="Times New Roman" w:hAnsi="Times New Roman"/>
+              </w:rPr>
+              <w:t>{{COT_CHOT}}</w:t>
             </w:r>
           </w:p>
         </w:tc>
@@ -1554,11 +1455,17 @@
             <w:hideMark/>
           </w:tcPr>
           <w:p>
+            <w:pPr>
+              <w:jc w:val="center"/>
+              <w:rPr>
+                <w:rFonts w:ascii="Times New Roman" w:hAnsi="Times New Roman"/>
+              </w:rPr>
+            </w:pPr>
             <w:r>
               <w:rPr>
-                <w:sz w:val="26"/>
-              </w:rPr>
-              <w:t>{{TL_MB}}</w:t>
+                <w:rFonts w:ascii="Times New Roman" w:hAnsi="Times New Roman"/>
+              </w:rPr>
+              <w:t>{{TL_COT}}</w:t>
             </w:r>
           </w:p>
         </w:tc>
@@ -1585,10 +1492,17 @@
             <w:r>
               <w:rPr>
                 <w:rFonts w:ascii="Times New Roman" w:hAnsi="Times New Roman"/>
-                <w:sz w:val="26"/>
                 <w:szCs w:val="28"/>
               </w:rPr>
-              <w:t>Phòng máy mặt đất</w:t>
+              <w:t xml:space="preserve">Phòng máy </w:t>
+            </w:r>
+            <w:r>
+              <w:rPr>
+                <w:rFonts w:ascii="Times New Roman" w:hAnsi="Times New Roman"/>
+                <w:szCs w:val="28"/>
+              </w:rPr>
+              <w:lastRenderedPageBreak/>
+              <w:t>mặt đất</w:t>
             </w:r>
           </w:p>
         </w:tc>
@@ -1614,10 +1528,15 @@
             <w:vAlign w:val="center"/>
           </w:tcPr>
           <w:p>
+            <w:pPr>
+              <w:jc w:val="center"/>
+              <w:rPr>
+                <w:rFonts w:ascii="Times New Roman" w:hAnsi="Times New Roman"/>
+              </w:rPr>
+            </w:pPr>
             <w:r>
               <w:rPr>
                 <w:rFonts w:ascii="Times New Roman" w:hAnsi="Times New Roman"/>
-                <w:sz w:val="26"/>
               </w:rPr>
               <w:t>{{PM_1245}}</w:t>
             </w:r>
@@ -1630,7 +1549,7 @@
           </w:tcPr>
           <w:p>
             <w:pPr>
-              <w:jc w:val="right"/>
+              <w:jc w:val="center"/>
               <w:rPr>
                 <w:rFonts w:ascii="Times New Roman" w:hAnsi="Times New Roman"/>
                 <w:sz w:val="28"/>
@@ -1645,9 +1564,15 @@
             <w:vAlign w:val="center"/>
           </w:tcPr>
           <w:p>
+            <w:pPr>
+              <w:jc w:val="center"/>
+              <w:rPr>
+                <w:rFonts w:ascii="Times New Roman" w:hAnsi="Times New Roman"/>
+              </w:rPr>
+            </w:pPr>
             <w:r>
               <w:rPr>
-                <w:sz w:val="26"/>
+                <w:rFonts w:ascii="Times New Roman" w:hAnsi="Times New Roman"/>
               </w:rPr>
               <w:t>{{P_PM}}</w:t>
             </w:r>
@@ -1659,9 +1584,15 @@
             <w:vAlign w:val="center"/>
           </w:tcPr>
           <w:p>
+            <w:pPr>
+              <w:jc w:val="center"/>
+              <w:rPr>
+                <w:rFonts w:ascii="Times New Roman" w:hAnsi="Times New Roman"/>
+              </w:rPr>
+            </w:pPr>
             <w:r>
               <w:rPr>
-                <w:sz w:val="26"/>
+                <w:rFonts w:ascii="Times New Roman" w:hAnsi="Times New Roman"/>
               </w:rPr>
               <w:t>{{TL_PM}}</w:t>
             </w:r>
@@ -1694,7 +1625,6 @@
                 <w:rFonts w:ascii="Times New Roman" w:hAnsi="Times New Roman"/>
                 <w:b/>
                 <w:bCs/>
-                <w:sz w:val="26"/>
                 <w:szCs w:val="28"/>
               </w:rPr>
               <w:t>Tổng cộng</w:t>
@@ -1708,10 +1638,15 @@
             <w:vAlign w:val="center"/>
           </w:tcPr>
           <w:p>
+            <w:pPr>
+              <w:jc w:val="center"/>
+              <w:rPr>
+                <w:rFonts w:ascii="Times New Roman" w:hAnsi="Times New Roman"/>
+              </w:rPr>
+            </w:pPr>
             <w:r>
               <w:rPr>
                 <w:rFonts w:ascii="Times New Roman" w:hAnsi="Times New Roman"/>
-                <w:sz w:val="26"/>
               </w:rPr>
               <w:t>{{TONG_QD}}</w:t>
             </w:r>
@@ -1723,10 +1658,15 @@
             <w:vAlign w:val="center"/>
           </w:tcPr>
           <w:p>
+            <w:pPr>
+              <w:jc w:val="center"/>
+              <w:rPr>
+                <w:rFonts w:ascii="Times New Roman" w:hAnsi="Times New Roman"/>
+              </w:rPr>
+            </w:pPr>
             <w:r>
               <w:rPr>
                 <w:rFonts w:ascii="Times New Roman" w:hAnsi="Times New Roman"/>
-                <w:sz w:val="26"/>
               </w:rPr>
               <w:t>{{TONG_CHOT}}</w:t>
             </w:r>
@@ -1738,10 +1678,15 @@
             <w:vAlign w:val="center"/>
           </w:tcPr>
           <w:p>
+            <w:pPr>
+              <w:jc w:val="center"/>
+              <w:rPr>
+                <w:rFonts w:ascii="Times New Roman" w:hAnsi="Times New Roman"/>
+              </w:rPr>
+            </w:pPr>
             <w:r>
               <w:rPr>
                 <w:rFonts w:ascii="Times New Roman" w:hAnsi="Times New Roman"/>
-                <w:sz w:val="26"/>
               </w:rPr>
               <w:t>{{TL_TONG}}</w:t>
             </w:r>
@@ -1767,9 +1712,21 @@
       </w:pPr>
       <w:r>
         <w:rPr>
-          <w:sz w:val="26"/>
-        </w:rPr>
-        <w:t>Thời gian áp dụng giá thuê mới: Kể từ ngày {{START_DATE}}.</w:t>
+          <w:rFonts w:ascii="Times New Roman" w:hAnsi="Times New Roman"/>
+        </w:rPr>
+        <w:t>Thời gian áp dụng giá thuê mới: Kể từ ngày</w:t>
+      </w:r>
+      <w:r>
+        <w:rPr>
+          <w:rFonts w:ascii="Times New Roman" w:hAnsi="Times New Roman"/>
+        </w:rPr>
+        <w:t xml:space="preserve"> 01/10/2025</w:t>
+      </w:r>
+      <w:r>
+        <w:rPr>
+          <w:rFonts w:ascii="Times New Roman" w:hAnsi="Times New Roman"/>
+        </w:rPr>
+        <w:t>.</w:t>
       </w:r>
     </w:p>
     <w:p>
@@ -1787,7 +1744,6 @@
       <w:r>
         <w:rPr>
           <w:rFonts w:ascii="Times New Roman" w:hAnsi="Times New Roman"/>
-          <w:sz w:val="26"/>
           <w:szCs w:val="28"/>
           <w:lang w:val="vi-VN"/>
         </w:rPr>
@@ -1795,36 +1751,48 @@
       </w:r>
       <w:r>
         <w:rPr>
-          <w:rStyle w:val="Emphasis"/>
-          <w:rFonts w:ascii="Times New Roman" w:hAnsi="Times New Roman"/>
-          <w:i w:val="0"/>
-          <w:sz w:val="26"/>
+          <w:rFonts w:ascii="Times New Roman" w:hAnsi="Times New Roman"/>
+        </w:rPr>
+        <w:t>{{LY_DO}}</w:t>
+      </w:r>
+      <w:r>
+        <w:rPr>
+          <w:rFonts w:ascii="Times New Roman" w:hAnsi="Times New Roman"/>
+          <w:b/>
+          <w:bCs/>
+        </w:rPr>
+        <w:t xml:space="preserve"> </w:t>
+      </w:r>
+      <w:r>
+        <w:rPr>
+          <w:rFonts w:ascii="Times New Roman" w:hAnsi="Times New Roman"/>
+        </w:rPr>
+        <w:t>hợp đồng thuê trạm {{SITE_ID}}</w:t>
+      </w:r>
+      <w:r>
+        <w:rPr>
+          <w:rFonts w:ascii="Times New Roman" w:hAnsi="Times New Roman"/>
+        </w:rPr>
+        <w:t xml:space="preserve"> </w:t>
+      </w:r>
+      <w:r>
+        <w:rPr>
+          <w:rFonts w:ascii="Times New Roman" w:hAnsi="Times New Roman"/>
           <w:szCs w:val="28"/>
           <w:lang w:val="vi-VN"/>
         </w:rPr>
-        <w:t>thay đổi giá thuê</w:t>
-      </w:r>
-      <w:r>
-        <w:rPr>
-          <w:rFonts w:ascii="Times New Roman" w:hAnsi="Times New Roman"/>
-          <w:sz w:val="26"/>
+        <w:t>để Phòng</w:t>
+      </w:r>
+      <w:r>
+        <w:rPr>
+          <w:rFonts w:ascii="Times New Roman" w:hAnsi="Times New Roman"/>
           <w:szCs w:val="28"/>
-          <w:lang w:val="vi-VN"/>
-        </w:rPr>
-        <w:t xml:space="preserve"> hợp đồng để Phòng</w:t>
-      </w:r>
-      <w:r>
-        <w:rPr>
-          <w:rFonts w:ascii="Times New Roman" w:hAnsi="Times New Roman"/>
-          <w:sz w:val="26"/>
-          <w:szCs w:val="28"/>
         </w:rPr>
         <w:t xml:space="preserve"> </w:t>
       </w:r>
       <w:r>
         <w:rPr>
           <w:rFonts w:ascii="Times New Roman" w:hAnsi="Times New Roman"/>
-          <w:sz w:val="26"/>
           <w:szCs w:val="28"/>
           <w:lang w:val="vi-VN"/>
         </w:rPr>
@@ -1850,7 +1818,6 @@
       <w:r>
         <w:rPr>
           <w:rFonts w:ascii="Times New Roman" w:hAnsi="Times New Roman"/>
-          <w:sz w:val="26"/>
           <w:szCs w:val="28"/>
         </w:rPr>
         <w:t> </w:t>
@@ -1888,7 +1855,6 @@
                 <w:rFonts w:ascii="Times New Roman" w:hAnsi="Times New Roman"/>
                 <w:b/>
                 <w:i/>
-                <w:sz w:val="26"/>
                 <w:szCs w:val="24"/>
               </w:rPr>
               <w:t>Nơi nhận:</w:t>
@@ -1914,81 +1880,30 @@
             <w:r>
               <w:rPr>
                 <w:rFonts w:ascii="Times New Roman" w:hAnsi="Times New Roman"/>
-                <w:sz w:val="26"/>
                 <w:szCs w:val="22"/>
               </w:rPr>
-              <w:t>- Nh</w:t>
+              <w:t>- Như trên;</w:t>
+            </w:r>
+          </w:p>
+          <w:p>
+            <w:pPr>
+              <w:spacing w:before="120"/>
+              <w:rPr>
+                <w:rFonts w:ascii="Times New Roman" w:hAnsi="Times New Roman"/>
+                <w:sz w:val="28"/>
+                <w:szCs w:val="28"/>
+              </w:rPr>
+            </w:pPr>
+            <w:r>
+              <w:rPr>
+                <w:rFonts w:ascii="Times New Roman" w:hAnsi="Times New Roman"/>
+                <w:szCs w:val="22"/>
+              </w:rPr>
+              <w:t>- Lưu: VT; P.VT</w:t>
             </w:r>
             <w:r>
               <w:rPr>
-                <w:rFonts w:ascii="Times New Roman" w:hAnsi="Times New Roman" w:cs="Cambria"/>
-                <w:sz w:val="26"/>
-                <w:szCs w:val="22"/>
-              </w:rPr>
-              <w:t>ư</w:t>
-            </w:r>
-            <w:r>
-              <w:rPr>
-                <w:rFonts w:ascii="Times New Roman" w:hAnsi="Times New Roman"/>
-                <w:sz w:val="26"/>
-                <w:szCs w:val="22"/>
-              </w:rPr>
-              <w:t xml:space="preserve"> tr</w:t>
-            </w:r>
-            <w:r>
-              <w:rPr>
-                <w:rFonts w:ascii="Times New Roman" w:hAnsi="Times New Roman" w:cs="Segoe Print"/>
-                <w:sz w:val="26"/>
-                <w:szCs w:val="22"/>
-              </w:rPr>
-              <w:t>ê</w:t>
-            </w:r>
-            <w:r>
-              <w:rPr>
-                <w:rFonts w:ascii="Times New Roman" w:hAnsi="Times New Roman"/>
-                <w:sz w:val="26"/>
-                <w:szCs w:val="22"/>
-              </w:rPr>
-              <w:t>n;</w:t>
-            </w:r>
-          </w:p>
-          <w:p>
-            <w:pPr>
-              <w:spacing w:before="120"/>
-              <w:rPr>
-                <w:rFonts w:ascii="Times New Roman" w:hAnsi="Times New Roman"/>
-                <w:sz w:val="28"/>
-                <w:szCs w:val="28"/>
-              </w:rPr>
-            </w:pPr>
-            <w:r>
-              <w:rPr>
-                <w:rFonts w:ascii="Times New Roman" w:hAnsi="Times New Roman"/>
-                <w:sz w:val="26"/>
-                <w:szCs w:val="22"/>
-              </w:rPr>
-              <w:t>- L</w:t>
-            </w:r>
-            <w:r>
-              <w:rPr>
-                <w:rFonts w:ascii="Times New Roman" w:hAnsi="Times New Roman" w:cs="Cambria"/>
-                <w:sz w:val="26"/>
-                <w:szCs w:val="22"/>
-              </w:rPr>
-              <w:t>ư</w:t>
-            </w:r>
-            <w:r>
-              <w:rPr>
-                <w:rFonts w:ascii="Times New Roman" w:hAnsi="Times New Roman"/>
-                <w:sz w:val="26"/>
-                <w:szCs w:val="22"/>
-              </w:rPr>
-              <w:t>u: VT; P.VT</w:t>
-            </w:r>
-            <w:r>
-              <w:rPr>
-                <w:rFonts w:ascii="Times New Roman" w:hAnsi="Times New Roman"/>
-                <w:sz w:val="26"/>
+                <w:rFonts w:ascii="Times New Roman" w:hAnsi="Times New Roman"/>
                 <w:szCs w:val="22"/>
                 <w:lang w:val="vi-VN"/>
               </w:rPr>
@@ -2036,7 +1951,6 @@
               <w:rPr>
                 <w:rFonts w:ascii="Times New Roman" w:hAnsi="Times New Roman"/>
                 <w:b/>
-                <w:sz w:val="26"/>
                 <w:szCs w:val="28"/>
                 <w:lang w:eastAsia="vi-VN"/>
               </w:rPr>
@@ -2061,7 +1975,6 @@
                 <w:rFonts w:ascii="Times New Roman" w:hAnsi="Times New Roman"/>
                 <w:b/>
                 <w:bCs/>
-                <w:sz w:val="26"/>
                 <w:szCs w:val="28"/>
               </w:rPr>
               <w:t>TRƯỞNG PHÒNG</w:t>
@@ -2177,10 +2090,9 @@
             <w:r>
               <w:rPr>
                 <w:rFonts w:ascii="Times New Roman" w:hAnsi="Times New Roman"/>
-                <w:sz w:val="26"/>
                 <w:szCs w:val="28"/>
               </w:rPr>
-              <w:t xml:space="preserve">    </w:t>
+              <w:t xml:space="preserve"> </w:t>
             </w:r>
           </w:p>
         </w:tc>
@@ -2229,7 +2141,6 @@
               <w:rPr>
                 <w:rFonts w:ascii="Times New Roman" w:hAnsi="Times New Roman"/>
                 <w:b/>
-                <w:sz w:val="26"/>
                 <w:szCs w:val="28"/>
               </w:rPr>
               <w:t>Nguyễn Đức Long</w:t>
@@ -2239,123 +2150,9 @@
       </w:tr>
     </w:tbl>
     <w:p>
-      <w:pPr>
-        <w:tabs>
-          <w:tab w:val="left" w:pos="426"/>
-          <w:tab w:val="left" w:pos="810"/>
-          <w:tab w:val="left" w:pos="3240"/>
-        </w:tabs>
-        <w:spacing w:before="120" w:line="360" w:lineRule="exact"/>
-        <w:ind w:left="540" w:firstLine="720"/>
-        <w:jc w:val="both"/>
-        <w:rPr>
-          <w:rFonts w:ascii="Times New Roman" w:hAnsi="Times New Roman"/>
-          <w:sz w:val="28"/>
-          <w:szCs w:val="28"/>
-        </w:rPr>
-      </w:pPr>
-    </w:p>
-    <w:p>
-      <w:pPr>
-        <w:tabs>
-          <w:tab w:val="left" w:pos="426"/>
-          <w:tab w:val="left" w:pos="810"/>
-          <w:tab w:val="left" w:pos="3240"/>
-        </w:tabs>
-        <w:spacing w:before="120" w:line="360" w:lineRule="exact"/>
-        <w:ind w:left="540" w:firstLine="720"/>
-        <w:jc w:val="both"/>
-        <w:rPr>
-          <w:rFonts w:ascii="Times New Roman" w:hAnsi="Times New Roman"/>
-          <w:sz w:val="28"/>
-          <w:szCs w:val="28"/>
-        </w:rPr>
-      </w:pPr>
-    </w:p>
-    <w:p>
-      <w:pPr>
-        <w:tabs>
-          <w:tab w:val="left" w:pos="426"/>
-          <w:tab w:val="left" w:pos="810"/>
-          <w:tab w:val="left" w:pos="3240"/>
-        </w:tabs>
-        <w:spacing w:before="120" w:line="360" w:lineRule="exact"/>
-        <w:ind w:left="540" w:firstLine="720"/>
-        <w:jc w:val="both"/>
-        <w:rPr>
-          <w:rFonts w:ascii="Times New Roman" w:hAnsi="Times New Roman"/>
-          <w:sz w:val="28"/>
-          <w:szCs w:val="28"/>
-        </w:rPr>
-      </w:pPr>
-    </w:p>
-    <w:p>
-      <w:pPr>
-        <w:tabs>
-          <w:tab w:val="left" w:pos="426"/>
-          <w:tab w:val="left" w:pos="810"/>
-          <w:tab w:val="left" w:pos="3240"/>
-        </w:tabs>
-        <w:spacing w:before="120" w:line="360" w:lineRule="exact"/>
-        <w:ind w:left="540" w:firstLine="720"/>
-        <w:jc w:val="both"/>
-        <w:rPr>
-          <w:rFonts w:ascii="Times New Roman" w:hAnsi="Times New Roman"/>
-          <w:sz w:val="28"/>
-          <w:szCs w:val="28"/>
-        </w:rPr>
-      </w:pPr>
-    </w:p>
-    <w:p>
-      <w:pPr>
-        <w:tabs>
-          <w:tab w:val="left" w:pos="426"/>
-          <w:tab w:val="left" w:pos="810"/>
-          <w:tab w:val="left" w:pos="3240"/>
-        </w:tabs>
-        <w:spacing w:before="120" w:line="360" w:lineRule="exact"/>
-        <w:ind w:left="540" w:firstLine="720"/>
-        <w:jc w:val="both"/>
-        <w:rPr>
-          <w:rFonts w:ascii="Times New Roman" w:hAnsi="Times New Roman"/>
-          <w:sz w:val="28"/>
-          <w:szCs w:val="28"/>
-        </w:rPr>
-      </w:pPr>
-    </w:p>
-    <w:p>
-      <w:pPr>
-        <w:tabs>
-          <w:tab w:val="left" w:pos="426"/>
-          <w:tab w:val="left" w:pos="810"/>
-          <w:tab w:val="left" w:pos="3240"/>
-        </w:tabs>
-        <w:spacing w:before="120" w:line="360" w:lineRule="exact"/>
-        <w:ind w:left="540" w:firstLine="720"/>
-        <w:jc w:val="both"/>
-        <w:rPr>
-          <w:rFonts w:ascii="Times New Roman" w:hAnsi="Times New Roman"/>
-          <w:sz w:val="28"/>
-          <w:szCs w:val="28"/>
-        </w:rPr>
-      </w:pPr>
-    </w:p>
-    <w:p>
-      <w:pPr>
-        <w:tabs>
-          <w:tab w:val="left" w:pos="426"/>
-          <w:tab w:val="left" w:pos="810"/>
-          <w:tab w:val="left" w:pos="3240"/>
-        </w:tabs>
-        <w:spacing w:before="120" w:line="360" w:lineRule="exact"/>
-        <w:ind w:left="540" w:firstLine="720"/>
-        <w:jc w:val="both"/>
-        <w:rPr>
-          <w:rFonts w:ascii="Times New Roman" w:hAnsi="Times New Roman"/>
-          <w:sz w:val="28"/>
-          <w:szCs w:val="28"/>
-        </w:rPr>
-      </w:pPr>
+      <w:r>
+        <w:br w:type="page"/>
+      </w:r>
     </w:p>
     <w:tbl>
       <w:tblPr>
@@ -2369,7 +2166,7 @@
       </w:tblGrid>
       <w:tr>
         <w:trPr>
-          <w:trHeight w:val="1217"/>
+          <w:trHeight w:val="812"/>
         </w:trPr>
         <w:tc>
           <w:tcPr>
@@ -2380,6 +2177,7 @@
               <w:tabs>
                 <w:tab w:val="left" w:pos="4586"/>
               </w:tabs>
+              <w:jc w:val="center"/>
               <w:rPr>
                 <w:rFonts w:ascii="Times New Roman" w:hAnsi="Times New Roman"/>
               </w:rPr>
@@ -2387,11 +2185,22 @@
             <w:r>
               <w:rPr>
                 <w:rFonts w:ascii="Times New Roman" w:hAnsi="Times New Roman"/>
-                <w:sz w:val="26"/>
               </w:rPr>
               <w:lastRenderedPageBreak/>
-              <w:t>TỔNG CÔNG TY VIỄN THÔNG MOBIFONE</w:t>
+              <w:t>T</w:t>
             </w:r>
+            <w:r>
+              <w:rPr>
+                <w:rFonts w:ascii="Times New Roman" w:hAnsi="Times New Roman"/>
+              </w:rPr>
+              <w:t>CT</w:t>
+            </w:r>
+            <w:r>
+              <w:rPr>
+                <w:rFonts w:ascii="Times New Roman" w:hAnsi="Times New Roman"/>
+              </w:rPr>
+              <w:t xml:space="preserve"> VIỄN THÔNG MOBIFONE</w:t>
+            </w:r>
           </w:p>
           <w:p>
             <w:pPr>
@@ -2405,7 +2214,6 @@
               <w:rPr>
                 <w:rFonts w:ascii="Times New Roman" w:hAnsi="Times New Roman"/>
                 <w:b/>
-                <w:sz w:val="26"/>
               </w:rPr>
               <w:t>MOBIFONE ĐỒNG NAI</w:t>
             </w:r>
@@ -2421,27 +2229,10 @@
             <w:r>
               <w:rPr>
                 <w:rFonts w:ascii="Times New Roman" w:hAnsi="Times New Roman"/>
-                <w:sz w:val="26"/>
+                <w:sz w:val="12"/>
                 <w:szCs w:val="26"/>
               </w:rPr>
-              <w:t>___________________</w:t>
-            </w:r>
-            <w:r>
-              <w:rPr>
-                <w:rFonts w:ascii="Times New Roman" w:hAnsi="Times New Roman"/>
-                <w:sz w:val="26"/>
-                <w:szCs w:val="26"/>
-                <w:lang w:val="vi-VN"/>
-              </w:rPr>
-              <w:t>---------------------------------------------</w:t>
-            </w:r>
-            <w:r>
-              <w:rPr>
-                <w:rFonts w:ascii="Times New Roman" w:hAnsi="Times New Roman"/>
-                <w:sz w:val="26"/>
-                <w:szCs w:val="26"/>
-              </w:rPr>
-              <w:t>______________________</w:t>
+              <w:t>_________________________________________</w:t>
             </w:r>
           </w:p>
           <w:p>
@@ -2471,7 +2262,6 @@
               <w:rPr>
                 <w:rFonts w:ascii="Times New Roman" w:hAnsi="Times New Roman"/>
                 <w:b/>
-                <w:sz w:val="26"/>
                 <w:szCs w:val="26"/>
               </w:rPr>
               <w:t>CỘNG HÒA XÃ HỘI CHỦ NGHĨA VIỆT NAM</w:t>
@@ -2489,7 +2279,6 @@
               <w:rPr>
                 <w:rFonts w:ascii="Times New Roman" w:hAnsi="Times New Roman"/>
                 <w:b/>
-                <w:sz w:val="26"/>
                 <w:szCs w:val="26"/>
               </w:rPr>
               <w:t>Độc lập - Tự do - Hạnh phúc</w:t>
@@ -2506,27 +2295,10 @@
             <w:r>
               <w:rPr>
                 <w:rFonts w:ascii="Times New Roman" w:hAnsi="Times New Roman"/>
-                <w:sz w:val="26"/>
+                <w:sz w:val="12"/>
                 <w:szCs w:val="26"/>
               </w:rPr>
-              <w:t>_____________</w:t>
-            </w:r>
-            <w:r>
-              <w:rPr>
-                <w:rFonts w:ascii="Times New Roman" w:hAnsi="Times New Roman"/>
-                <w:sz w:val="26"/>
-                <w:szCs w:val="26"/>
-                <w:lang w:val="vi-VN"/>
-              </w:rPr>
-              <w:t>-----------------------------------------------------------</w:t>
-            </w:r>
-            <w:r>
-              <w:rPr>
-                <w:rFonts w:ascii="Times New Roman" w:hAnsi="Times New Roman"/>
-                <w:sz w:val="26"/>
-                <w:szCs w:val="26"/>
-              </w:rPr>
-              <w:t>_____________</w:t>
+              <w:t>__________________________</w:t>
             </w:r>
           </w:p>
           <w:p>
@@ -2554,11 +2326,38 @@
     </w:tbl>
     <w:p>
       <w:pPr>
-        <w:rPr>
-          <w:rFonts w:ascii="Times New Roman" w:hAnsi="Times New Roman"/>
-          <w:sz w:val="8"/>
-        </w:rPr>
-      </w:pPr>
+        <w:jc w:val="center"/>
+        <w:rPr>
+          <w:rFonts w:ascii="Times New Roman" w:hAnsi="Times New Roman"/>
+          <w:b/>
+          <w:szCs w:val="26"/>
+        </w:rPr>
+      </w:pPr>
+      <w:r>
+        <w:rPr>
+          <w:rFonts w:ascii="Times New Roman" w:hAnsi="Times New Roman"/>
+          <w:b/>
+          <w:szCs w:val="26"/>
+        </w:rPr>
+        <w:t xml:space="preserve">PHỤ LỤC HỢP ĐỒNG SỐ </w:t>
+      </w:r>
+      <w:r>
+        <w:rPr>
+          <w:rFonts w:ascii="Times New Roman" w:hAnsi="Times New Roman"/>
+          <w:b/>
+          <w:szCs w:val="26"/>
+          <w:lang w:val="vi-VN"/>
+        </w:rPr>
+        <w:t>0</w:t>
+      </w:r>
+      <w:r>
+        <w:rPr>
+          <w:rFonts w:ascii="Times New Roman" w:hAnsi="Times New Roman"/>
+          <w:b/>
+          <w:szCs w:val="26"/>
+        </w:rPr>
+        <w:t>2</w:t>
+      </w:r>
     </w:p>
     <w:p>
       <w:pPr>
@@ -2566,64 +2365,44 @@
         <w:rPr>
           <w:rFonts w:ascii="Times New Roman" w:hAnsi="Times New Roman"/>
           <w:b/>
-          <w:sz w:val="36"/>
-          <w:szCs w:val="36"/>
-        </w:rPr>
-      </w:pPr>
+          <w:bCs/>
+          <w:szCs w:val="26"/>
+        </w:rPr>
+      </w:pPr>
+      <w:r>
+        <w:rPr>
+          <w:rFonts w:ascii="Times New Roman" w:hAnsi="Times New Roman"/>
+          <w:szCs w:val="26"/>
+        </w:rPr>
+        <w:t xml:space="preserve"> </w:t>
+      </w:r>
       <w:r>
         <w:rPr>
           <w:rFonts w:ascii="Times New Roman" w:hAnsi="Times New Roman"/>
           <w:b/>
-          <w:sz w:val="26"/>
-          <w:szCs w:val="36"/>
-        </w:rPr>
-        <w:t xml:space="preserve">PHỤ LỤC HỢP ĐỒNG SỐ </w:t>
+          <w:bCs/>
+          <w:szCs w:val="26"/>
+        </w:rPr>
+        <w:t xml:space="preserve">V/v </w:t>
       </w:r>
       <w:r>
         <w:rPr>
           <w:rFonts w:ascii="Times New Roman" w:hAnsi="Times New Roman"/>
           <w:b/>
-          <w:sz w:val="26"/>
-          <w:szCs w:val="36"/>
-          <w:lang w:val="vi-VN"/>
-        </w:rPr>
-        <w:t>0</w:t>
+          <w:bCs/>
+          <w:szCs w:val="26"/>
+        </w:rPr>
+        <w:t xml:space="preserve">{{LY_DO}} </w:t>
       </w:r>
       <w:r>
         <w:rPr>
           <w:rFonts w:ascii="Times New Roman" w:hAnsi="Times New Roman"/>
           <w:b/>
-          <w:sz w:val="26"/>
-          <w:szCs w:val="36"/>
-        </w:rPr>
-        <w:t>2</w:t>
-      </w:r>
-    </w:p>
-    <w:p>
-      <w:pPr>
-        <w:jc w:val="center"/>
-        <w:rPr>
-          <w:rFonts w:ascii="Times New Roman" w:hAnsi="Times New Roman"/>
-          <w:sz w:val="28"/>
-          <w:szCs w:val="28"/>
-        </w:rPr>
-      </w:pPr>
-      <w:r>
-        <w:rPr>
-          <w:rFonts w:ascii="Times New Roman" w:hAnsi="Times New Roman"/>
-          <w:sz w:val="26"/>
-        </w:rPr>
-        <w:t xml:space="preserve">       V/v thay đổi điều khoản hợp đồng {{CONTRACT_NO}} ({{SITE_ID}})</w:t>
-      </w:r>
-    </w:p>
-    <w:p>
-      <w:pPr>
-        <w:jc w:val="center"/>
-        <w:rPr>
-          <w:rFonts w:ascii="Times New Roman" w:hAnsi="Times New Roman"/>
-          <w:szCs w:val="26"/>
-        </w:rPr>
-      </w:pPr>
+          <w:bCs/>
+          <w:szCs w:val="26"/>
+        </w:rPr>
+        <w:t>hợp đồng {{CONTRACT_NO}} ({{SITE_ID}})</w:t>
+      </w:r>
     </w:p>
     <w:p>
       <w:pPr>
@@ -2632,18 +2411,34 @@
         <w:jc w:val="both"/>
         <w:rPr>
           <w:rFonts w:ascii="Times New Roman" w:hAnsi="Times New Roman"/>
+          <w:bCs/>
           <w:noProof/>
-          <w:sz w:val="28"/>
-          <w:szCs w:val="28"/>
-        </w:rPr>
-      </w:pPr>
-      <w:r>
-        <w:rPr>
-          <w:rFonts w:ascii="Times New Roman" w:hAnsi="Times New Roman"/>
-          <w:b/>
-          <w:sz w:val="26"/>
-        </w:rPr>
-        <w:t>Căn cứ hợp đồng số {{CONTRACT_NO}} ký ngày {{CONTRACT_DATE}} giữa Trung tâm Mạng lưới MobiFone miền Nam và Ông/Bà {{OWNER_NAME}} về việc thuê đặt trạm BTS địa chỉ: {{ADDRESS_OLD}} ({{ADDRESS_NEW}}).</w:t>
+          <w:szCs w:val="26"/>
+        </w:rPr>
+      </w:pPr>
+      <w:r>
+        <w:rPr>
+          <w:rFonts w:ascii="Times New Roman" w:hAnsi="Times New Roman"/>
+          <w:bCs/>
+          <w:szCs w:val="26"/>
+        </w:rPr>
+        <w:t>Căn cứ hợp đồng số {{CONTRACT_NO}} ký ngày {{CONTRACT_DATE}} giữa Trung tâm Mạng lưới MobiFone miền Nam</w:t>
+      </w:r>
+      <w:r>
+        <w:rPr>
+          <w:rFonts w:ascii="Times New Roman" w:hAnsi="Times New Roman"/>
+          <w:bCs/>
+          <w:szCs w:val="26"/>
+        </w:rPr>
+        <w:t xml:space="preserve"> ( nay MobiFone Đồng Nai tiếp quản) </w:t>
+      </w:r>
+      <w:r>
+        <w:rPr>
+          <w:rFonts w:ascii="Times New Roman" w:hAnsi="Times New Roman"/>
+          <w:bCs/>
+          <w:szCs w:val="26"/>
+        </w:rPr>
+        <w:t>và Ông/Bà {{OWNER_NAME}} về việc thuê đặt trạm BTS địa chỉ: {{ADDRESS_OLD}} ({{ADDRESS_NEW}}).</w:t>
       </w:r>
     </w:p>
     <w:p>
@@ -2653,54 +2448,29 @@
         <w:jc w:val="both"/>
         <w:rPr>
           <w:rFonts w:ascii="Times New Roman" w:hAnsi="Times New Roman"/>
-          <w:i/>
-          <w:iCs/>
-          <w:sz w:val="28"/>
-          <w:szCs w:val="28"/>
-        </w:rPr>
-      </w:pPr>
-      <w:r>
-        <w:rPr>
-          <w:rFonts w:ascii="Times New Roman" w:hAnsi="Times New Roman"/>
-          <w:sz w:val="26"/>
-        </w:rPr>
-        <w:t>Căn cứ phụ lục hợp đồng kí ngày 01/12/2025 chuyển chủ thể kí hợp đồng từ Trung tâm Mạng lưới MobiFone miền Nam qua MobiFone Đồng Nai của hợp đồng số {{CONTRACT_NO}}</w:t>
-      </w:r>
-    </w:p>
-    <w:p>
-      <w:pPr>
-        <w:spacing w:before="120" w:line="320" w:lineRule="exact"/>
-        <w:ind w:firstLine="720"/>
-        <w:jc w:val="both"/>
-        <w:rPr>
-          <w:rFonts w:ascii="Times New Roman" w:hAnsi="Times New Roman"/>
-          <w:sz w:val="8"/>
-          <w:szCs w:val="26"/>
-          <w:lang w:val="vi-VN"/>
-        </w:rPr>
-      </w:pPr>
-      <w:r>
-        <w:rPr>
-          <w:rFonts w:ascii="Times New Roman" w:hAnsi="Times New Roman"/>
-          <w:sz w:val="26"/>
-          <w:szCs w:val="28"/>
-          <w:lang w:val="vi-VN"/>
-        </w:rPr>
-        <w:t>Hôm nay, ngày     tháng     năm  202</w:t>
-      </w:r>
-      <w:r>
-        <w:rPr>
-          <w:rFonts w:ascii="Times New Roman" w:hAnsi="Times New Roman"/>
-          <w:sz w:val="26"/>
-          <w:szCs w:val="28"/>
+          <w:szCs w:val="26"/>
+          <w:lang w:val="vi-VN"/>
+        </w:rPr>
+      </w:pPr>
+      <w:r>
+        <w:rPr>
+          <w:rFonts w:ascii="Times New Roman" w:hAnsi="Times New Roman"/>
+          <w:szCs w:val="26"/>
+          <w:lang w:val="vi-VN"/>
+        </w:rPr>
+        <w:t>Hôm nay, ngày      tháng      năm  202</w:t>
+      </w:r>
+      <w:r>
+        <w:rPr>
+          <w:rFonts w:ascii="Times New Roman" w:hAnsi="Times New Roman"/>
+          <w:szCs w:val="26"/>
         </w:rPr>
         <w:t>6,</w:t>
       </w:r>
       <w:r>
         <w:rPr>
           <w:rFonts w:ascii="Times New Roman" w:hAnsi="Times New Roman"/>
-          <w:sz w:val="26"/>
-          <w:szCs w:val="28"/>
+          <w:szCs w:val="26"/>
           <w:lang w:val="vi-VN"/>
         </w:rPr>
         <w:t xml:space="preserve"> tại </w:t>
@@ -2708,8 +2478,7 @@
       <w:r>
         <w:rPr>
           <w:rFonts w:ascii="Times New Roman" w:hAnsi="Times New Roman"/>
-          <w:sz w:val="26"/>
-          <w:szCs w:val="28"/>
+          <w:szCs w:val="26"/>
         </w:rPr>
         <w:t>MobiFone Đồng Nai</w:t>
       </w:r>
@@ -2721,13 +2490,13 @@
           <w:tab w:val="left" w:pos="2880"/>
         </w:tabs>
         <w:spacing w:before="120" w:line="320" w:lineRule="exact"/>
+        <w:ind w:firstLine="709"/>
         <w:jc w:val="both"/>
         <w:rPr>
           <w:rFonts w:ascii="Times New Roman" w:hAnsi="Times New Roman"/>
           <w:b/>
           <w:bCs/>
-          <w:sz w:val="28"/>
-          <w:szCs w:val="28"/>
+          <w:szCs w:val="26"/>
           <w:lang w:val="vi-VN"/>
         </w:rPr>
       </w:pPr>
@@ -2736,7 +2505,7 @@
           <w:rFonts w:ascii="Times New Roman" w:hAnsi="Times New Roman"/>
           <w:b/>
           <w:bCs/>
-          <w:sz w:val="26"/>
+          <w:szCs w:val="26"/>
         </w:rPr>
         <w:t xml:space="preserve">Một bên là: Ông/Bà {{OWNER_NAME}} (Gọi tắt là bên A) </w:t>
       </w:r>
@@ -2756,16 +2525,14 @@
         <w:rPr>
           <w:rFonts w:ascii="Times New Roman" w:hAnsi="Times New Roman"/>
           <w:noProof/>
-          <w:sz w:val="28"/>
-          <w:szCs w:val="28"/>
+          <w:szCs w:val="26"/>
         </w:rPr>
       </w:pPr>
       <w:r>
         <w:rPr>
           <w:rFonts w:ascii="Times New Roman" w:hAnsi="Times New Roman"/>
           <w:noProof/>
-          <w:sz w:val="26"/>
-          <w:szCs w:val="28"/>
+          <w:szCs w:val="26"/>
         </w:rPr>
         <w:t>Chức vụ</w:t>
       </w:r>
@@ -2773,8 +2540,7 @@
         <w:rPr>
           <w:rFonts w:ascii="Times New Roman" w:hAnsi="Times New Roman"/>
           <w:noProof/>
-          <w:sz w:val="26"/>
-          <w:szCs w:val="28"/>
+          <w:szCs w:val="26"/>
         </w:rPr>
         <w:tab/>
         <w:t>: Chủ trạm</w:t>
@@ -2795,21 +2561,20 @@
         <w:rPr>
           <w:rFonts w:ascii="Times New Roman" w:hAnsi="Times New Roman"/>
           <w:noProof/>
-          <w:sz w:val="28"/>
-          <w:szCs w:val="28"/>
-        </w:rPr>
-      </w:pPr>
-      <w:r>
-        <w:rPr>
-          <w:rFonts w:ascii="Times New Roman" w:hAnsi="Times New Roman"/>
-          <w:sz w:val="26"/>
+          <w:szCs w:val="26"/>
+        </w:rPr>
+      </w:pPr>
+      <w:r>
+        <w:rPr>
+          <w:rFonts w:ascii="Times New Roman" w:hAnsi="Times New Roman"/>
+          <w:szCs w:val="26"/>
         </w:rPr>
         <w:t xml:space="preserve">Địa chỉ trạm </w:t>
       </w:r>
       <w:r>
         <w:rPr>
           <w:rFonts w:ascii="Times New Roman" w:hAnsi="Times New Roman"/>
-          <w:sz w:val="26"/>
+          <w:szCs w:val="26"/>
         </w:rPr>
         <w:tab/>
         <w:t>:{{ADDRESS_OLD}} ({{ADDRESS_NEW}})</w:t>
@@ -2829,21 +2594,20 @@
         <w:jc w:val="both"/>
         <w:rPr>
           <w:rFonts w:ascii="Times New Roman" w:hAnsi="Times New Roman"/>
-          <w:sz w:val="28"/>
-          <w:szCs w:val="28"/>
-        </w:rPr>
-      </w:pPr>
-      <w:r>
-        <w:rPr>
-          <w:rFonts w:ascii="Times New Roman" w:hAnsi="Times New Roman"/>
-          <w:sz w:val="26"/>
+          <w:szCs w:val="26"/>
+        </w:rPr>
+      </w:pPr>
+      <w:r>
+        <w:rPr>
+          <w:rFonts w:ascii="Times New Roman" w:hAnsi="Times New Roman"/>
+          <w:szCs w:val="26"/>
         </w:rPr>
         <w:t>Địa chỉ liên hệ</w:t>
       </w:r>
       <w:r>
         <w:rPr>
           <w:rFonts w:ascii="Times New Roman" w:hAnsi="Times New Roman"/>
-          <w:sz w:val="26"/>
+          <w:szCs w:val="26"/>
         </w:rPr>
         <w:tab/>
         <w:t>: {{CONTACT_ADDR}}</w:t>
@@ -2863,21 +2627,20 @@
         <w:jc w:val="both"/>
         <w:rPr>
           <w:rFonts w:ascii="Times New Roman" w:hAnsi="Times New Roman"/>
-          <w:sz w:val="28"/>
-          <w:szCs w:val="28"/>
-        </w:rPr>
-      </w:pPr>
-      <w:r>
-        <w:rPr>
-          <w:rFonts w:ascii="Times New Roman" w:hAnsi="Times New Roman"/>
-          <w:sz w:val="26"/>
-        </w:rPr>
-        <w:t xml:space="preserve">Điện thọai   </w:t>
-      </w:r>
-      <w:r>
-        <w:rPr>
-          <w:rFonts w:ascii="Times New Roman" w:hAnsi="Times New Roman"/>
-          <w:sz w:val="26"/>
+          <w:szCs w:val="26"/>
+        </w:rPr>
+      </w:pPr>
+      <w:r>
+        <w:rPr>
+          <w:rFonts w:ascii="Times New Roman" w:hAnsi="Times New Roman"/>
+          <w:szCs w:val="26"/>
+        </w:rPr>
+        <w:t xml:space="preserve">Điện thọai </w:t>
+      </w:r>
+      <w:r>
+        <w:rPr>
+          <w:rFonts w:ascii="Times New Roman" w:hAnsi="Times New Roman"/>
+          <w:szCs w:val="26"/>
         </w:rPr>
         <w:tab/>
         <w:t>: {{PHONE}}</w:t>
@@ -2890,31 +2653,54 @@
           <w:ilvl w:val="0"/>
           <w:numId w:val="3"/>
         </w:numPr>
-        <w:tabs>
-          <w:tab w:val="left" w:pos="2880"/>
-        </w:tabs>
-        <w:spacing w:before="120" w:line="320" w:lineRule="exact"/>
+        <w:spacing w:before="120" w:line="360" w:lineRule="exact"/>
         <w:jc w:val="both"/>
         <w:rPr>
           <w:rFonts w:ascii="Times New Roman" w:hAnsi="Times New Roman"/>
-          <w:sz w:val="28"/>
-          <w:szCs w:val="28"/>
-        </w:rPr>
-      </w:pPr>
-      <w:r>
-        <w:rPr>
-          <w:rFonts w:ascii="Times New Roman" w:hAnsi="Times New Roman"/>
-          <w:sz w:val="26"/>
-        </w:rPr>
-        <w:t>Chủ tài khoản</w:t>
-      </w:r>
-      <w:r>
-        <w:rPr>
-          <w:rFonts w:ascii="Times New Roman" w:hAnsi="Times New Roman"/>
-          <w:sz w:val="26"/>
+          <w:bCs/>
+          <w:szCs w:val="26"/>
+          <w:lang w:val="vi-VN"/>
+        </w:rPr>
+      </w:pPr>
+      <w:r>
+        <w:rPr>
+          <w:rFonts w:ascii="Times New Roman" w:hAnsi="Times New Roman"/>
+          <w:bCs/>
+          <w:szCs w:val="26"/>
+        </w:rPr>
+        <w:t>Tên tài khoản</w:t>
+      </w:r>
+      <w:r>
+        <w:rPr>
+          <w:rFonts w:ascii="Times New Roman" w:hAnsi="Times New Roman"/>
+          <w:bCs/>
+          <w:szCs w:val="26"/>
         </w:rPr>
         <w:tab/>
-        <w:t>: {{ACCOUNT_OWNER}}</w:t>
+      </w:r>
+      <w:r>
+        <w:rPr>
+          <w:rFonts w:ascii="Times New Roman" w:hAnsi="Times New Roman"/>
+          <w:bCs/>
+          <w:szCs w:val="26"/>
+        </w:rPr>
+        <w:t>:</w:t>
+      </w:r>
+      <w:r>
+        <w:rPr>
+          <w:rFonts w:ascii="Times New Roman" w:hAnsi="Times New Roman"/>
+          <w:bCs/>
+          <w:szCs w:val="26"/>
+        </w:rPr>
+        <w:t xml:space="preserve"> </w:t>
+      </w:r>
+      <w:r>
+        <w:rPr>
+          <w:rFonts w:ascii="Times New Roman" w:hAnsi="Times New Roman"/>
+          <w:bCs/>
+          <w:szCs w:val="26"/>
+        </w:rPr>
+        <w:t>{{ACCOUNT_OWNER}}</w:t>
       </w:r>
     </w:p>
     <w:p>
@@ -2924,30 +2710,45 @@
           <w:ilvl w:val="0"/>
           <w:numId w:val="3"/>
         </w:numPr>
-        <w:tabs>
-          <w:tab w:val="left" w:pos="2880"/>
-        </w:tabs>
-        <w:spacing w:before="120" w:line="320" w:lineRule="exact"/>
+        <w:spacing w:before="120" w:line="360" w:lineRule="exact"/>
         <w:jc w:val="both"/>
         <w:rPr>
           <w:rFonts w:ascii="Times New Roman" w:hAnsi="Times New Roman"/>
-          <w:sz w:val="28"/>
-          <w:szCs w:val="28"/>
-        </w:rPr>
-      </w:pPr>
-      <w:r>
-        <w:rPr>
-          <w:rFonts w:ascii="Times New Roman" w:hAnsi="Times New Roman"/>
-          <w:sz w:val="26"/>
+          <w:bCs/>
+          <w:szCs w:val="26"/>
+          <w:lang w:val="vi-VN"/>
+        </w:rPr>
+      </w:pPr>
+      <w:r>
+        <w:rPr>
+          <w:rFonts w:ascii="Times New Roman" w:hAnsi="Times New Roman"/>
+          <w:bCs/>
+          <w:szCs w:val="26"/>
         </w:rPr>
         <w:t>Số tài khoản</w:t>
       </w:r>
       <w:r>
         <w:rPr>
           <w:rFonts w:ascii="Times New Roman" w:hAnsi="Times New Roman"/>
-          <w:sz w:val="26"/>
+          <w:bCs/>
+          <w:szCs w:val="26"/>
         </w:rPr>
         <w:tab/>
+      </w:r>
+      <w:r>
+        <w:rPr>
+          <w:rFonts w:ascii="Times New Roman" w:hAnsi="Times New Roman"/>
+          <w:bCs/>
+          <w:szCs w:val="26"/>
+        </w:rPr>
+        <w:tab/>
+      </w:r>
+      <w:r>
+        <w:rPr>
+          <w:rFonts w:ascii="Times New Roman" w:hAnsi="Times New Roman"/>
+          <w:bCs/>
+          <w:szCs w:val="26"/>
+        </w:rPr>
         <w:t>: {{ACCOUNT_NO}}</w:t>
       </w:r>
     </w:p>
@@ -2958,47 +2759,53 @@
           <w:ilvl w:val="0"/>
           <w:numId w:val="3"/>
         </w:numPr>
+        <w:spacing w:before="120" w:line="360" w:lineRule="exact"/>
+        <w:jc w:val="both"/>
+        <w:rPr>
+          <w:rFonts w:ascii="Times New Roman" w:hAnsi="Times New Roman"/>
+          <w:bCs/>
+          <w:szCs w:val="26"/>
+          <w:lang w:val="vi-VN"/>
+        </w:rPr>
+      </w:pPr>
+      <w:r>
+        <w:rPr>
+          <w:rFonts w:ascii="Times New Roman" w:hAnsi="Times New Roman"/>
+          <w:bCs/>
+          <w:szCs w:val="26"/>
+        </w:rPr>
+        <w:t>Tại ngân hàng</w:t>
+      </w:r>
+      <w:r>
+        <w:rPr>
+          <w:rFonts w:ascii="Times New Roman" w:hAnsi="Times New Roman"/>
+          <w:bCs/>
+          <w:szCs w:val="26"/>
+        </w:rPr>
+        <w:tab/>
+      </w:r>
+      <w:r>
+        <w:rPr>
+          <w:rFonts w:ascii="Times New Roman" w:hAnsi="Times New Roman"/>
+          <w:bCs/>
+          <w:szCs w:val="26"/>
+        </w:rPr>
+        <w:t>: {{BANK_NAME}}</w:t>
+      </w:r>
+    </w:p>
+    <w:p>
+      <w:pPr>
         <w:tabs>
           <w:tab w:val="left" w:pos="2880"/>
         </w:tabs>
         <w:spacing w:before="120" w:line="320" w:lineRule="exact"/>
-        <w:jc w:val="both"/>
-        <w:rPr>
-          <w:rFonts w:ascii="Times New Roman" w:hAnsi="Times New Roman"/>
-          <w:sz w:val="28"/>
-          <w:szCs w:val="28"/>
-          <w:lang w:val="vi-VN"/>
-        </w:rPr>
-      </w:pPr>
-      <w:r>
-        <w:rPr>
-          <w:rFonts w:ascii="Times New Roman" w:hAnsi="Times New Roman"/>
-          <w:sz w:val="26"/>
-        </w:rPr>
-        <w:t>Ngân hàng</w:t>
-      </w:r>
-      <w:r>
-        <w:rPr>
-          <w:rFonts w:ascii="Times New Roman" w:hAnsi="Times New Roman"/>
-          <w:sz w:val="26"/>
-        </w:rPr>
-        <w:tab/>
-        <w:t>: {{BANK_NAME}}</w:t>
-      </w:r>
-    </w:p>
-    <w:p>
-      <w:pPr>
-        <w:tabs>
-          <w:tab w:val="left" w:pos="2880"/>
-        </w:tabs>
-        <w:spacing w:before="120" w:line="320" w:lineRule="exact"/>
+        <w:ind w:firstLine="709"/>
         <w:jc w:val="both"/>
         <w:rPr>
           <w:rFonts w:ascii="Times New Roman" w:hAnsi="Times New Roman"/>
           <w:b/>
           <w:noProof/>
-          <w:sz w:val="28"/>
-          <w:szCs w:val="28"/>
+          <w:szCs w:val="26"/>
           <w:lang w:val="vi-VN"/>
         </w:rPr>
       </w:pPr>
@@ -3007,8 +2814,7 @@
           <w:rFonts w:ascii="Times New Roman" w:hAnsi="Times New Roman"/>
           <w:b/>
           <w:noProof/>
-          <w:sz w:val="26"/>
-          <w:szCs w:val="28"/>
+          <w:szCs w:val="26"/>
           <w:lang w:val="vi-VN"/>
         </w:rPr>
         <w:t>Một bên là:</w:t>
@@ -3017,8 +2823,7 @@
         <w:rPr>
           <w:rFonts w:ascii="Times New Roman" w:hAnsi="Times New Roman"/>
           <w:noProof/>
-          <w:sz w:val="26"/>
-          <w:szCs w:val="28"/>
+          <w:szCs w:val="26"/>
           <w:lang w:val="vi-VN"/>
         </w:rPr>
         <w:t xml:space="preserve"> </w:t>
@@ -3028,8 +2833,7 @@
           <w:rFonts w:ascii="Times New Roman" w:hAnsi="Times New Roman"/>
           <w:b/>
           <w:noProof/>
-          <w:sz w:val="26"/>
-          <w:szCs w:val="28"/>
+          <w:szCs w:val="26"/>
           <w:lang w:val="vi-VN"/>
         </w:rPr>
         <w:t xml:space="preserve">MobiFone Đồng Nai (Gọi tắt là bên </w:t>
@@ -3039,8 +2843,7 @@
           <w:rFonts w:ascii="Times New Roman" w:hAnsi="Times New Roman"/>
           <w:b/>
           <w:noProof/>
-          <w:sz w:val="26"/>
-          <w:szCs w:val="28"/>
+          <w:szCs w:val="26"/>
         </w:rPr>
         <w:t>B</w:t>
       </w:r>
@@ -3049,8 +2852,7 @@
           <w:rFonts w:ascii="Times New Roman" w:hAnsi="Times New Roman"/>
           <w:b/>
           <w:noProof/>
-          <w:sz w:val="26"/>
-          <w:szCs w:val="28"/>
+          <w:szCs w:val="26"/>
           <w:lang w:val="vi-VN"/>
         </w:rPr>
         <w:t>)</w:t>
@@ -3073,8 +2875,7 @@
           <w:rFonts w:ascii="Times New Roman" w:hAnsi="Times New Roman"/>
           <w:b/>
           <w:i w:val="0"/>
-          <w:sz w:val="28"/>
-          <w:szCs w:val="28"/>
+          <w:szCs w:val="26"/>
           <w:lang w:val="vi-VN"/>
         </w:rPr>
       </w:pPr>
@@ -3082,8 +2883,7 @@
         <w:rPr>
           <w:rFonts w:ascii="Times New Roman" w:hAnsi="Times New Roman"/>
           <w:noProof/>
-          <w:sz w:val="26"/>
-          <w:szCs w:val="28"/>
+          <w:szCs w:val="26"/>
           <w:lang w:val="vi-VN"/>
         </w:rPr>
         <w:t xml:space="preserve">Đại diện là </w:t>
@@ -3092,8 +2892,7 @@
         <w:rPr>
           <w:rFonts w:ascii="Times New Roman" w:hAnsi="Times New Roman"/>
           <w:noProof/>
-          <w:sz w:val="26"/>
-          <w:szCs w:val="28"/>
+          <w:szCs w:val="26"/>
           <w:lang w:val="vi-VN"/>
         </w:rPr>
         <w:tab/>
@@ -3106,8 +2905,7 @@
           <w:b/>
           <w:i w:val="0"/>
           <w:iCs w:val="0"/>
-          <w:sz w:val="26"/>
-          <w:szCs w:val="28"/>
+          <w:szCs w:val="26"/>
           <w:lang w:val="vi-VN"/>
         </w:rPr>
         <w:t>Nguyễn Thanh Lâm</w:t>
@@ -3128,8 +2926,7 @@
         <w:rPr>
           <w:rFonts w:ascii="Times New Roman" w:hAnsi="Times New Roman"/>
           <w:noProof/>
-          <w:sz w:val="28"/>
-          <w:szCs w:val="28"/>
+          <w:szCs w:val="26"/>
           <w:lang w:val="vi-VN"/>
         </w:rPr>
       </w:pPr>
@@ -3137,8 +2934,7 @@
         <w:rPr>
           <w:rFonts w:ascii="Times New Roman" w:hAnsi="Times New Roman"/>
           <w:noProof/>
-          <w:sz w:val="26"/>
-          <w:szCs w:val="28"/>
+          <w:szCs w:val="26"/>
           <w:lang w:val="vi-VN"/>
         </w:rPr>
         <w:t>Chức vụ</w:t>
@@ -3147,8 +2943,7 @@
         <w:rPr>
           <w:rFonts w:ascii="Times New Roman" w:hAnsi="Times New Roman"/>
           <w:noProof/>
-          <w:sz w:val="26"/>
-          <w:szCs w:val="28"/>
+          <w:szCs w:val="26"/>
           <w:lang w:val="vi-VN"/>
         </w:rPr>
         <w:tab/>
@@ -3170,8 +2965,7 @@
         <w:rPr>
           <w:rFonts w:ascii="Times New Roman" w:hAnsi="Times New Roman"/>
           <w:noProof/>
-          <w:sz w:val="28"/>
-          <w:szCs w:val="28"/>
+          <w:szCs w:val="26"/>
           <w:lang w:val="vi-VN"/>
         </w:rPr>
       </w:pPr>
@@ -3179,8 +2973,7 @@
         <w:rPr>
           <w:rFonts w:ascii="Times New Roman" w:hAnsi="Times New Roman"/>
           <w:noProof/>
-          <w:sz w:val="26"/>
-          <w:szCs w:val="28"/>
+          <w:szCs w:val="26"/>
           <w:lang w:val="vi-VN"/>
         </w:rPr>
         <w:t>Địa chỉ</w:t>
@@ -3189,8 +2982,7 @@
         <w:rPr>
           <w:rFonts w:ascii="Times New Roman" w:hAnsi="Times New Roman"/>
           <w:noProof/>
-          <w:sz w:val="26"/>
-          <w:szCs w:val="28"/>
+          <w:szCs w:val="26"/>
           <w:lang w:val="vi-VN"/>
         </w:rPr>
         <w:tab/>
@@ -3200,8 +2992,7 @@
         <w:rPr>
           <w:rFonts w:ascii="Times New Roman" w:hAnsi="Times New Roman"/>
           <w:noProof/>
-          <w:sz w:val="26"/>
-          <w:szCs w:val="28"/>
+          <w:szCs w:val="26"/>
         </w:rPr>
         <w:t xml:space="preserve"> Tp </w:t>
       </w:r>
@@ -3209,8 +3000,7 @@
         <w:rPr>
           <w:rFonts w:ascii="Times New Roman" w:hAnsi="Times New Roman"/>
           <w:noProof/>
-          <w:sz w:val="26"/>
-          <w:szCs w:val="28"/>
+          <w:szCs w:val="26"/>
           <w:lang w:val="vi-VN"/>
         </w:rPr>
         <w:t>Đồng Nai</w:t>
@@ -3231,16 +3021,14 @@
         <w:rPr>
           <w:rFonts w:ascii="Times New Roman" w:hAnsi="Times New Roman"/>
           <w:noProof/>
-          <w:sz w:val="28"/>
-          <w:szCs w:val="28"/>
+          <w:szCs w:val="26"/>
         </w:rPr>
       </w:pPr>
       <w:r>
         <w:rPr>
           <w:rFonts w:ascii="Times New Roman" w:hAnsi="Times New Roman"/>
           <w:noProof/>
-          <w:sz w:val="26"/>
-          <w:szCs w:val="28"/>
+          <w:szCs w:val="26"/>
         </w:rPr>
         <w:t>Điện thoại</w:t>
       </w:r>
@@ -3248,8 +3036,7 @@
         <w:rPr>
           <w:rFonts w:ascii="Times New Roman" w:hAnsi="Times New Roman"/>
           <w:noProof/>
-          <w:sz w:val="26"/>
-          <w:szCs w:val="28"/>
+          <w:szCs w:val="26"/>
         </w:rPr>
         <w:tab/>
         <w:t>: 0908 316 316</w:t>
@@ -3258,8 +3045,7 @@
         <w:rPr>
           <w:rFonts w:ascii="Times New Roman" w:hAnsi="Times New Roman"/>
           <w:noProof/>
-          <w:sz w:val="26"/>
-          <w:szCs w:val="28"/>
+          <w:szCs w:val="26"/>
         </w:rPr>
         <w:tab/>
       </w:r>
@@ -3279,16 +3065,14 @@
         <w:rPr>
           <w:rFonts w:ascii="Times New Roman" w:hAnsi="Times New Roman"/>
           <w:noProof/>
-          <w:sz w:val="28"/>
-          <w:szCs w:val="28"/>
+          <w:szCs w:val="26"/>
         </w:rPr>
       </w:pPr>
       <w:r>
         <w:rPr>
           <w:rFonts w:ascii="Times New Roman" w:hAnsi="Times New Roman"/>
           <w:noProof/>
-          <w:sz w:val="26"/>
-          <w:szCs w:val="28"/>
+          <w:szCs w:val="26"/>
         </w:rPr>
         <w:t xml:space="preserve">Tài khoản </w:t>
       </w:r>
@@ -3296,8 +3080,7 @@
         <w:rPr>
           <w:rFonts w:ascii="Times New Roman" w:hAnsi="Times New Roman"/>
           <w:noProof/>
-          <w:sz w:val="26"/>
-          <w:szCs w:val="28"/>
+          <w:szCs w:val="26"/>
         </w:rPr>
         <w:tab/>
         <w:t xml:space="preserve">: </w:t>
@@ -3305,8 +3088,7 @@
       <w:r>
         <w:rPr>
           <w:rFonts w:ascii="Times New Roman" w:hAnsi="Times New Roman"/>
-          <w:sz w:val="26"/>
-          <w:szCs w:val="28"/>
+          <w:szCs w:val="26"/>
         </w:rPr>
         <w:t>0121000620394</w:t>
       </w:r>
@@ -3323,17 +3105,15 @@
         <w:rPr>
           <w:rFonts w:ascii="Times New Roman" w:hAnsi="Times New Roman"/>
           <w:noProof/>
-          <w:sz w:val="28"/>
-          <w:szCs w:val="28"/>
-        </w:rPr>
-      </w:pPr>
-      <w:r>
-        <w:rPr>
-          <w:rFonts w:ascii="Times New Roman" w:hAnsi="Times New Roman"/>
-          <w:sz w:val="26"/>
-          <w:szCs w:val="28"/>
-        </w:rPr>
-        <w:t>Ngân hàng             : Ngân Hàng TMCP Ngoại thương VN - CN Đồng Nai</w:t>
+          <w:szCs w:val="26"/>
+        </w:rPr>
+      </w:pPr>
+      <w:r>
+        <w:rPr>
+          <w:rFonts w:ascii="Times New Roman" w:hAnsi="Times New Roman"/>
+          <w:szCs w:val="26"/>
+        </w:rPr>
+        <w:t>Ngân hàng : Ngân Hàng TMCP Ngoại thương VN - CN Đồng Nai</w:t>
       </w:r>
     </w:p>
     <w:p>
@@ -3348,28 +3128,25 @@
         <w:rPr>
           <w:rFonts w:ascii="Times New Roman" w:hAnsi="Times New Roman"/>
           <w:noProof/>
-          <w:sz w:val="28"/>
-          <w:szCs w:val="28"/>
+          <w:szCs w:val="26"/>
         </w:rPr>
       </w:pPr>
       <w:r>
         <w:rPr>
           <w:rFonts w:ascii="Times New Roman" w:hAnsi="Times New Roman"/>
           <w:noProof/>
-          <w:sz w:val="26"/>
-          <w:szCs w:val="28"/>
-        </w:rPr>
-        <w:t xml:space="preserve">MST    </w:t>
+          <w:szCs w:val="26"/>
+        </w:rPr>
+        <w:t xml:space="preserve">MST </w:t>
       </w:r>
       <w:r>
         <w:rPr>
           <w:rFonts w:ascii="Times New Roman" w:hAnsi="Times New Roman"/>
           <w:noProof/>
-          <w:sz w:val="26"/>
-          <w:szCs w:val="28"/>
+          <w:szCs w:val="26"/>
         </w:rPr>
         <w:tab/>
-        <w:t xml:space="preserve">          : 0100686209-129</w:t>
+        <w:t>: 0100686209-129</w:t>
       </w:r>
     </w:p>
     <w:p>
@@ -3379,20 +3156,19 @@
           <w:tab w:val="left" w:pos="2880"/>
         </w:tabs>
         <w:spacing w:before="120" w:line="320" w:lineRule="exact"/>
+        <w:ind w:firstLine="709"/>
         <w:jc w:val="both"/>
         <w:rPr>
           <w:rFonts w:ascii="Times New Roman" w:hAnsi="Times New Roman"/>
-          <w:sz w:val="28"/>
-          <w:szCs w:val="28"/>
-        </w:rPr>
-      </w:pPr>
-      <w:r>
-        <w:rPr>
-          <w:rFonts w:ascii="Times New Roman" w:hAnsi="Times New Roman"/>
-          <w:sz w:val="26"/>
-          <w:szCs w:val="28"/>
-        </w:rPr>
-        <w:t xml:space="preserve">           (Căn cứ giấy ủy quyền số 08/UQ-MBF.ĐNa ký ngày 22/01/2026)</w:t>
+          <w:szCs w:val="26"/>
+        </w:rPr>
+      </w:pPr>
+      <w:r>
+        <w:rPr>
+          <w:rFonts w:ascii="Times New Roman" w:hAnsi="Times New Roman"/>
+          <w:szCs w:val="26"/>
+        </w:rPr>
+        <w:t xml:space="preserve"> (Căn cứ giấy ủy quyền số 21/UQ-MBF.ĐNa ký ngày 19/06/2026)</w:t>
       </w:r>
     </w:p>
     <w:p>
@@ -3402,53 +3178,16 @@
         <w:jc w:val="both"/>
         <w:rPr>
           <w:rFonts w:ascii="Times New Roman" w:hAnsi="Times New Roman"/>
-          <w:sz w:val="28"/>
-          <w:szCs w:val="28"/>
-        </w:rPr>
-      </w:pPr>
-      <w:r>
-        <w:rPr>
-          <w:rFonts w:ascii="Times New Roman" w:hAnsi="Times New Roman"/>
-          <w:sz w:val="26"/>
+          <w:szCs w:val="26"/>
+        </w:rPr>
+      </w:pPr>
+      <w:r>
+        <w:rPr>
+          <w:rFonts w:ascii="Times New Roman" w:hAnsi="Times New Roman"/>
+          <w:szCs w:val="26"/>
         </w:rPr>
         <w:t>Sau khi bàn bạc thỏa thuận, hai bên thống nhất ký kết phụ lục hợp đồng điều chỉnh điều khoản hợp đồng số {{CONTRACT_NO}} ký ngày {{CONTRACT_DATE}} như sau:</w:t>
       </w:r>
-    </w:p>
-    <w:p>
-      <w:pPr>
-        <w:spacing w:before="120" w:line="320" w:lineRule="exact"/>
-        <w:ind w:firstLine="720"/>
-        <w:jc w:val="both"/>
-        <w:rPr>
-          <w:rFonts w:ascii="Times New Roman" w:hAnsi="Times New Roman"/>
-          <w:sz w:val="28"/>
-          <w:szCs w:val="28"/>
-        </w:rPr>
-      </w:pPr>
-    </w:p>
-    <w:p>
-      <w:pPr>
-        <w:spacing w:before="120" w:line="320" w:lineRule="exact"/>
-        <w:ind w:firstLine="720"/>
-        <w:jc w:val="both"/>
-        <w:rPr>
-          <w:rFonts w:ascii="Times New Roman" w:hAnsi="Times New Roman"/>
-          <w:sz w:val="28"/>
-          <w:szCs w:val="28"/>
-        </w:rPr>
-      </w:pPr>
-    </w:p>
-    <w:p>
-      <w:pPr>
-        <w:spacing w:before="120" w:line="320" w:lineRule="exact"/>
-        <w:ind w:firstLine="720"/>
-        <w:jc w:val="both"/>
-        <w:rPr>
-          <w:rFonts w:ascii="Times New Roman" w:hAnsi="Times New Roman"/>
-          <w:sz w:val="28"/>
-          <w:szCs w:val="28"/>
-        </w:rPr>
-      </w:pPr>
     </w:p>
     <w:p>
       <w:pPr>
@@ -3465,8 +3204,7 @@
         <w:jc w:val="both"/>
         <w:rPr>
           <w:rFonts w:ascii="Times New Roman" w:hAnsi="Times New Roman"/>
-          <w:sz w:val="28"/>
-          <w:szCs w:val="28"/>
+          <w:szCs w:val="26"/>
           <w:lang w:val="vi-VN"/>
         </w:rPr>
       </w:pPr>
@@ -3475,19 +3213,16 @@
           <w:rFonts w:ascii="Times New Roman" w:hAnsi="Times New Roman"/>
           <w:b/>
           <w:bCs/>
-          <w:sz w:val="26"/>
-          <w:szCs w:val="28"/>
-        </w:rPr>
-        <w:lastRenderedPageBreak/>
-        <w:t xml:space="preserve">   </w:t>
+          <w:szCs w:val="26"/>
+        </w:rPr>
+        <w:t xml:space="preserve"> </w:t>
       </w:r>
       <w:r>
         <w:rPr>
           <w:rFonts w:ascii="Times New Roman" w:hAnsi="Times New Roman"/>
           <w:b/>
           <w:bCs/>
-          <w:sz w:val="26"/>
-          <w:szCs w:val="28"/>
+          <w:szCs w:val="26"/>
           <w:lang w:val="vi-VN"/>
         </w:rPr>
         <w:t xml:space="preserve">Điều chỉnh điều </w:t>
@@ -3497,8 +3232,7 @@
           <w:rFonts w:ascii="Times New Roman" w:hAnsi="Times New Roman"/>
           <w:b/>
           <w:bCs/>
-          <w:sz w:val="26"/>
-          <w:szCs w:val="28"/>
+          <w:szCs w:val="26"/>
         </w:rPr>
         <w:t>3: Giá</w:t>
       </w:r>
@@ -3507,8 +3241,7 @@
           <w:rFonts w:ascii="Times New Roman" w:hAnsi="Times New Roman"/>
           <w:b/>
           <w:bCs/>
-          <w:sz w:val="26"/>
-          <w:szCs w:val="28"/>
+          <w:szCs w:val="26"/>
           <w:lang w:val="vi-VN"/>
         </w:rPr>
         <w:t xml:space="preserve"> thuê</w:t>
@@ -3516,8 +3249,7 @@
       <w:r>
         <w:rPr>
           <w:rFonts w:ascii="Times New Roman" w:hAnsi="Times New Roman"/>
-          <w:sz w:val="26"/>
-          <w:szCs w:val="28"/>
+          <w:szCs w:val="26"/>
           <w:lang w:val="vi-VN"/>
         </w:rPr>
         <w:t xml:space="preserve"> </w:t>
@@ -3527,18 +3259,34 @@
           <w:rFonts w:ascii="Times New Roman" w:hAnsi="Times New Roman"/>
           <w:b/>
           <w:bCs/>
-          <w:sz w:val="26"/>
-          <w:szCs w:val="28"/>
-        </w:rPr>
-        <w:t xml:space="preserve">và Phương thước </w:t>
+          <w:szCs w:val="26"/>
+        </w:rPr>
+        <w:t>và Phương th</w:t>
       </w:r>
       <w:r>
         <w:rPr>
           <w:rFonts w:ascii="Times New Roman" w:hAnsi="Times New Roman"/>
           <w:b/>
           <w:bCs/>
-          <w:sz w:val="26"/>
-          <w:szCs w:val="28"/>
+          <w:szCs w:val="26"/>
+        </w:rPr>
+        <w:t>ức</w:t>
+      </w:r>
+      <w:r>
+        <w:rPr>
+          <w:rFonts w:ascii="Times New Roman" w:hAnsi="Times New Roman"/>
+          <w:b/>
+          <w:bCs/>
+          <w:szCs w:val="26"/>
+        </w:rPr>
+        <w:t xml:space="preserve"> </w:t>
+      </w:r>
+      <w:r>
+        <w:rPr>
+          <w:rFonts w:ascii="Times New Roman" w:hAnsi="Times New Roman"/>
+          <w:b/>
+          <w:bCs/>
+          <w:szCs w:val="26"/>
           <w:lang w:val="vi-VN"/>
         </w:rPr>
         <w:t>thanh toán</w:t>
@@ -3546,8 +3294,7 @@
       <w:r>
         <w:rPr>
           <w:rFonts w:ascii="Times New Roman" w:hAnsi="Times New Roman"/>
-          <w:sz w:val="26"/>
-          <w:szCs w:val="28"/>
+          <w:szCs w:val="26"/>
           <w:lang w:val="vi-VN"/>
         </w:rPr>
         <w:t xml:space="preserve"> </w:t>
@@ -3565,22 +3312,35 @@
         <w:rPr>
           <w:rFonts w:ascii="Times New Roman" w:hAnsi="Times New Roman"/>
           <w:bCs/>
-          <w:sz w:val="28"/>
-          <w:szCs w:val="28"/>
-          <w:lang w:val="vi-VN"/>
-        </w:rPr>
-      </w:pPr>
-      <w:r>
-        <w:rPr>
-          <w:rFonts w:ascii="Times New Roman" w:hAnsi="Times New Roman"/>
-          <w:sz w:val="26"/>
-        </w:rPr>
-        <w:t>Tổng giá thuê vị trí lắp đặt trạm, bảo vệ và hỗ trợ vận hàng khai thác ghi ở điều I và II được gộp tính thống nhất giữa hai bên đã bao gồm các khoản thuế do nhà nước quy định là: Giảm từ {{OLD_PRICE}} đồng/tháng thành {{NEW_PRICE}} đồng/tháng (Bằng chữ: {{NEW_PRICE_TEXT}}).</w:t>
-      </w:r>
-      <w:r>
-        <w:rPr>
-          <w:rFonts w:ascii="Times New Roman" w:hAnsi="Times New Roman"/>
-          <w:sz w:val="26"/>
+          <w:szCs w:val="26"/>
+          <w:lang w:val="vi-VN"/>
+        </w:rPr>
+      </w:pPr>
+      <w:r>
+        <w:rPr>
+          <w:rFonts w:ascii="Times New Roman" w:hAnsi="Times New Roman"/>
+          <w:szCs w:val="26"/>
+        </w:rPr>
+        <w:t>Tổng giá thuê vị trí lắp đặt trạm, bảo vệ và hỗ trợ vận hàn</w:t>
+      </w:r>
+      <w:r>
+        <w:rPr>
+          <w:rFonts w:ascii="Times New Roman" w:hAnsi="Times New Roman"/>
+          <w:szCs w:val="26"/>
+        </w:rPr>
+        <w:t>h</w:t>
+      </w:r>
+      <w:r>
+        <w:rPr>
+          <w:rFonts w:ascii="Times New Roman" w:hAnsi="Times New Roman"/>
+          <w:szCs w:val="26"/>
+        </w:rPr>
+        <w:t xml:space="preserve"> khai thác ghi ở điều I và II được gộp tính thống nhất giữa hai bên đã bao gồm các khoản thuế do nhà nước quy định là: Giảm từ {{OLD_PRICE}} đồng/tháng thành {{NEW_PRICE}} đồng/tháng (Bằng chữ: {{NEW_PRICE_TEXT}}).</w:t>
+      </w:r>
+      <w:r>
+        <w:rPr>
+          <w:rFonts w:ascii="Times New Roman" w:hAnsi="Times New Roman"/>
+          <w:szCs w:val="26"/>
         </w:rPr>
         <w:tab/>
       </w:r>
@@ -3596,17 +3356,38 @@
         <w:jc w:val="both"/>
         <w:rPr>
           <w:rFonts w:ascii="Times New Roman" w:hAnsi="Times New Roman"/>
+          <w:b/>
           <w:bCs/>
-          <w:sz w:val="28"/>
-          <w:szCs w:val="28"/>
-          <w:lang w:val="vi-VN"/>
-        </w:rPr>
-      </w:pPr>
-      <w:r>
-        <w:rPr>
-          <w:sz w:val="26"/>
-        </w:rPr>
-        <w:t>Thời điểm bắt đầu tính tiền: Kể từ ngày {{START_DATE}} đến ngày {{END_DATE}}</w:t>
+          <w:szCs w:val="26"/>
+          <w:lang w:val="vi-VN"/>
+        </w:rPr>
+      </w:pPr>
+      <w:r>
+        <w:rPr>
+          <w:rFonts w:ascii="Times New Roman" w:hAnsi="Times New Roman"/>
+          <w:b/>
+          <w:bCs/>
+          <w:szCs w:val="26"/>
+        </w:rPr>
+        <w:t xml:space="preserve">Thời điểm bắt đầu tính tiền: Kể từ ngày </w:t>
+      </w:r>
+      <w:r>
+        <w:rPr>
+          <w:rFonts w:ascii="Times New Roman" w:hAnsi="Times New Roman"/>
+          <w:b/>
+          <w:bCs/>
+          <w:szCs w:val="26"/>
+        </w:rPr>
+        <w:t>{{START_DATE}}</w:t>
+      </w:r>
+      <w:r>
+        <w:rPr>
+          <w:rFonts w:ascii="Times New Roman" w:hAnsi="Times New Roman"/>
+          <w:b/>
+          <w:bCs/>
+          <w:szCs w:val="26"/>
+        </w:rPr>
+        <w:t xml:space="preserve"> đến ngày {{END_DATE}}</w:t>
       </w:r>
     </w:p>
     <w:p>
@@ -3622,8 +3403,7 @@
           <w:rFonts w:ascii="Times New Roman" w:hAnsi="Times New Roman"/>
           <w:b/>
           <w:bCs/>
-          <w:sz w:val="28"/>
-          <w:szCs w:val="28"/>
+          <w:szCs w:val="26"/>
           <w:lang w:val="vi-VN"/>
         </w:rPr>
       </w:pPr>
@@ -3631,7 +3411,7 @@
         <w:rPr>
           <w:rFonts w:ascii="Times New Roman" w:hAnsi="Times New Roman"/>
           <w:b/>
-          <w:sz w:val="26"/>
+          <w:szCs w:val="26"/>
         </w:rPr>
         <w:t>{{DEDUCTION_TEXT}}</w:t>
       </w:r>
@@ -3647,16 +3427,14 @@
         <w:jc w:val="both"/>
         <w:rPr>
           <w:rFonts w:ascii="Times New Roman" w:hAnsi="Times New Roman"/>
-          <w:sz w:val="28"/>
-          <w:szCs w:val="28"/>
-          <w:lang w:val="vi-VN"/>
-        </w:rPr>
-      </w:pPr>
-      <w:r>
-        <w:rPr>
-          <w:rFonts w:ascii="Times New Roman" w:hAnsi="Times New Roman"/>
-          <w:sz w:val="26"/>
-          <w:szCs w:val="28"/>
+          <w:szCs w:val="26"/>
+          <w:lang w:val="vi-VN"/>
+        </w:rPr>
+      </w:pPr>
+      <w:r>
+        <w:rPr>
+          <w:rFonts w:ascii="Times New Roman" w:hAnsi="Times New Roman"/>
+          <w:szCs w:val="26"/>
           <w:lang w:val="vi-VN"/>
         </w:rPr>
         <w:t>Bằng tiền Việt Nam theo hình thức chuyển khoản hoặc nhờ chi hộ qua Ngân hàng.</w:t>
@@ -3673,8 +3451,7 @@
         <w:jc w:val="both"/>
         <w:rPr>
           <w:rFonts w:ascii="Times New Roman" w:hAnsi="Times New Roman"/>
-          <w:sz w:val="28"/>
-          <w:szCs w:val="28"/>
+          <w:szCs w:val="26"/>
           <w:lang w:val="vi-VN"/>
         </w:rPr>
       </w:pPr>
@@ -3682,10 +3459,10 @@
         <w:rPr>
           <w:rFonts w:ascii="Times New Roman" w:hAnsi="Times New Roman"/>
           <w:b/>
-          <w:sz w:val="26"/>
-          <w:szCs w:val="28"/>
-          <w:lang w:val="vi-VN"/>
-        </w:rPr>
+          <w:szCs w:val="26"/>
+          <w:lang w:val="vi-VN"/>
+        </w:rPr>
+        <w:lastRenderedPageBreak/>
         <w:t>Thông tin tài khoản nhận thanh toán là:</w:t>
       </w:r>
     </w:p>
@@ -3701,17 +3478,15 @@
         <w:rPr>
           <w:rFonts w:ascii="Times New Roman" w:hAnsi="Times New Roman"/>
           <w:b/>
-          <w:sz w:val="28"/>
-          <w:szCs w:val="28"/>
-          <w:lang w:val="vi-VN"/>
-        </w:rPr>
-      </w:pPr>
-      <w:bookmarkStart w:id="0" w:name="_GoBack"/>
+          <w:szCs w:val="26"/>
+          <w:lang w:val="vi-VN"/>
+        </w:rPr>
+      </w:pPr>
       <w:r>
         <w:rPr>
           <w:rFonts w:ascii="Times New Roman" w:hAnsi="Times New Roman"/>
           <w:b/>
-          <w:sz w:val="26"/>
+          <w:szCs w:val="26"/>
         </w:rPr>
         <w:t>Tên tài khoản: {{ACCOUNT_OWNER}}</w:t>
       </w:r>
@@ -3728,8 +3503,7 @@
         <w:rPr>
           <w:rFonts w:ascii="Times New Roman" w:hAnsi="Times New Roman"/>
           <w:b/>
-          <w:sz w:val="28"/>
-          <w:szCs w:val="28"/>
+          <w:szCs w:val="26"/>
           <w:lang w:val="vi-VN"/>
         </w:rPr>
       </w:pPr>
@@ -3737,7 +3511,7 @@
         <w:rPr>
           <w:rFonts w:ascii="Times New Roman" w:hAnsi="Times New Roman"/>
           <w:b/>
-          <w:sz w:val="26"/>
+          <w:szCs w:val="26"/>
         </w:rPr>
         <w:t>Số tài khoản: {{ACCOUNT_NO}}</w:t>
       </w:r>
@@ -3754,8 +3528,7 @@
         <w:rPr>
           <w:rFonts w:ascii="Times New Roman" w:hAnsi="Times New Roman"/>
           <w:b/>
-          <w:sz w:val="28"/>
-          <w:szCs w:val="28"/>
+          <w:szCs w:val="26"/>
           <w:lang w:val="vi-VN"/>
         </w:rPr>
       </w:pPr>
@@ -3763,12 +3536,11 @@
         <w:rPr>
           <w:rFonts w:ascii="Times New Roman" w:hAnsi="Times New Roman"/>
           <w:b/>
-          <w:sz w:val="26"/>
+          <w:szCs w:val="26"/>
         </w:rPr>
         <w:t>Tại ngân hàng: {{BANK_NAME}}</w:t>
       </w:r>
     </w:p>
-    <w:bookmarkEnd w:id="0"/>
     <w:p>
       <w:pPr>
         <w:pStyle w:val="ListParagraph"/>
@@ -3782,19 +3554,15 @@
           <w:rFonts w:ascii="Times New Roman" w:hAnsi="Times New Roman"/>
           <w:b/>
           <w:bCs/>
-          <w:sz w:val="28"/>
-          <w:szCs w:val="28"/>
-          <w:lang w:val="vi-VN"/>
-        </w:rPr>
-      </w:pPr>
-      <w:r>
-        <w:rPr>
-          <w:rFonts w:ascii="Times New Roman" w:hAnsi="Times New Roman"/>
-          <w:sz w:val="26"/>
-          <w:szCs w:val="28"/>
-          <w:lang w:val="vi-VN"/>
-        </w:rPr>
-        <w:t>Bên B cam kết tài khoản nhận thanh toán là ổn định và không thay đổi trong suốt thời gian thuê, đồng thời chịu trách nhiệm nếu có bất kỳ khiếu nại nào liên quan đến việc nhận tiền thanh toán của hợp đồng này vào tài khoản nêu trên</w:t>
+          <w:szCs w:val="26"/>
+          <w:lang w:val="vi-VN"/>
+        </w:rPr>
+      </w:pPr>
+      <w:r>
+        <w:rPr>
+          <w:rFonts w:ascii="Times New Roman" w:hAnsi="Times New Roman"/>
+        </w:rPr>
+        <w:t>Bên A cam kết tài khoản nhận thanh toán là ổn định và không thay đổi trong suốt thời gian thuê, đồng thời chịu trách nhiệm nếu có bất kỳ khiếu nại nào liên quan đến việc nhận tiền thanh toán của hợp đồng này vào tài khoản nêu trên</w:t>
       </w:r>
     </w:p>
     <w:p>
@@ -3808,28 +3576,15 @@
         <w:jc w:val="both"/>
         <w:rPr>
           <w:rFonts w:ascii="Times New Roman" w:hAnsi="Times New Roman"/>
-          <w:sz w:val="28"/>
-          <w:szCs w:val="28"/>
-          <w:lang w:val="vi-VN"/>
-        </w:rPr>
-      </w:pPr>
-      <w:r>
-        <w:rPr>
-          <w:rFonts w:ascii="Times New Roman" w:hAnsi="Times New Roman"/>
-          <w:sz w:val="26"/>
-          <w:szCs w:val="28"/>
-          <w:lang w:val="vi-VN"/>
-        </w:rPr>
-        <w:t xml:space="preserve">Trường hợp thay đổi thông tin tài khoản nhận thanh toán, Bên B phải báo trước bằng văn bản cho bên A chậm nhất là 30 ngày trước khi đến hạn của chu kỳ thanh toán kế tiếp và hai bên sẽ tiến hành ký phụ lục điều chỉnh </w:t>
-      </w:r>
-      <w:r>
-        <w:rPr>
-          <w:rFonts w:ascii="Times New Roman" w:hAnsi="Times New Roman"/>
-          <w:sz w:val="26"/>
-          <w:szCs w:val="28"/>
-          <w:lang w:val="vi-VN"/>
-        </w:rPr>
-        <w:t>thông tin tài khoản nhận tiền  thanh toán.</w:t>
+          <w:szCs w:val="26"/>
+          <w:lang w:val="vi-VN"/>
+        </w:rPr>
+      </w:pPr>
+      <w:r>
+        <w:rPr>
+          <w:rFonts w:ascii="Times New Roman" w:hAnsi="Times New Roman"/>
+        </w:rPr>
+        <w:t>Trường hợp thay đổi thông tin tài khoản nhận thanh toán, Bên A phải báo trước bằng văn bản cho bên B chậm nhất là 30 ngày trước khi đến hạn của chu kỳ thanh toán kế tiếp và hai bên sẽ tiến hành ký phụ lục điều chỉnh thông tin tài khoản nhận tiền thanh toán.</w:t>
       </w:r>
     </w:p>
     <w:p>
@@ -3840,8 +3595,7 @@
         <w:rPr>
           <w:rFonts w:ascii="Times New Roman" w:hAnsi="Times New Roman"/>
           <w:i/>
-          <w:sz w:val="28"/>
-          <w:szCs w:val="28"/>
+          <w:szCs w:val="26"/>
           <w:lang w:val="en-SG"/>
         </w:rPr>
       </w:pPr>
@@ -3849,19 +3603,17 @@
         <w:rPr>
           <w:rFonts w:ascii="Times New Roman" w:hAnsi="Times New Roman"/>
           <w:i/>
-          <w:sz w:val="26"/>
-          <w:szCs w:val="28"/>
-          <w:lang w:val="vi-VN"/>
-        </w:rPr>
-        <w:t xml:space="preserve">           Chu</w:t>
+          <w:szCs w:val="26"/>
+          <w:lang w:val="vi-VN"/>
+        </w:rPr>
+        <w:t xml:space="preserve"> Chu</w:t>
       </w:r>
       <w:r>
         <w:rPr>
           <w:rFonts w:ascii="Times New Roman" w:hAnsi="Times New Roman"/>
           <w:i/>
           <w:spacing w:val="-1"/>
-          <w:sz w:val="26"/>
-          <w:szCs w:val="28"/>
+          <w:szCs w:val="26"/>
           <w:lang w:val="vi-VN"/>
         </w:rPr>
         <w:t xml:space="preserve"> </w:t>
@@ -3870,8 +3622,7 @@
         <w:rPr>
           <w:rFonts w:ascii="Times New Roman" w:hAnsi="Times New Roman"/>
           <w:i/>
-          <w:sz w:val="26"/>
-          <w:szCs w:val="28"/>
+          <w:szCs w:val="26"/>
           <w:lang w:val="vi-VN"/>
         </w:rPr>
         <w:t>kỳ</w:t>
@@ -3881,8 +3632,7 @@
           <w:rFonts w:ascii="Times New Roman" w:hAnsi="Times New Roman"/>
           <w:i/>
           <w:spacing w:val="-1"/>
-          <w:sz w:val="26"/>
-          <w:szCs w:val="28"/>
+          <w:szCs w:val="26"/>
           <w:lang w:val="vi-VN"/>
         </w:rPr>
         <w:t xml:space="preserve"> </w:t>
@@ -3891,8 +3641,7 @@
         <w:rPr>
           <w:rFonts w:ascii="Times New Roman" w:hAnsi="Times New Roman"/>
           <w:i/>
-          <w:sz w:val="26"/>
-          <w:szCs w:val="28"/>
+          <w:szCs w:val="26"/>
           <w:lang w:val="vi-VN"/>
         </w:rPr>
         <w:t>thanh</w:t>
@@ -3902,8 +3651,7 @@
           <w:rFonts w:ascii="Times New Roman" w:hAnsi="Times New Roman"/>
           <w:i/>
           <w:spacing w:val="-1"/>
-          <w:sz w:val="26"/>
-          <w:szCs w:val="28"/>
+          <w:szCs w:val="26"/>
           <w:lang w:val="vi-VN"/>
         </w:rPr>
         <w:t xml:space="preserve"> </w:t>
@@ -3912,8 +3660,7 @@
         <w:rPr>
           <w:rFonts w:ascii="Times New Roman" w:hAnsi="Times New Roman"/>
           <w:i/>
-          <w:sz w:val="26"/>
-          <w:szCs w:val="28"/>
+          <w:szCs w:val="26"/>
           <w:lang w:val="vi-VN"/>
         </w:rPr>
         <w:t>toán:</w:t>
@@ -3923,8 +3670,7 @@
           <w:rFonts w:ascii="Times New Roman" w:hAnsi="Times New Roman"/>
           <w:i/>
           <w:spacing w:val="-1"/>
-          <w:sz w:val="26"/>
-          <w:szCs w:val="28"/>
+          <w:szCs w:val="26"/>
           <w:lang w:val="vi-VN"/>
         </w:rPr>
         <w:t xml:space="preserve"> </w:t>
@@ -3932,8 +3678,7 @@
       <w:r>
         <w:rPr>
           <w:rFonts w:ascii="Times New Roman" w:hAnsi="Times New Roman"/>
-          <w:sz w:val="26"/>
-          <w:szCs w:val="28"/>
+          <w:szCs w:val="26"/>
           <w:lang w:val="vi-VN"/>
         </w:rPr>
         <w:t>06 tháng/ lần</w:t>
@@ -3942,8 +3687,7 @@
         <w:rPr>
           <w:rFonts w:ascii="Times New Roman" w:hAnsi="Times New Roman"/>
           <w:i/>
-          <w:sz w:val="26"/>
-          <w:szCs w:val="28"/>
+          <w:szCs w:val="26"/>
           <w:lang w:val="vi-VN"/>
         </w:rPr>
         <w:t>,</w:t>
@@ -3953,8 +3697,7 @@
           <w:rFonts w:ascii="Times New Roman" w:hAnsi="Times New Roman"/>
           <w:i/>
           <w:spacing w:val="-1"/>
-          <w:sz w:val="26"/>
-          <w:szCs w:val="28"/>
+          <w:szCs w:val="26"/>
           <w:lang w:val="vi-VN"/>
         </w:rPr>
         <w:t xml:space="preserve"> </w:t>
@@ -3963,8 +3706,7 @@
         <w:rPr>
           <w:rFonts w:ascii="Times New Roman" w:hAnsi="Times New Roman"/>
           <w:i/>
-          <w:sz w:val="26"/>
-          <w:szCs w:val="28"/>
+          <w:szCs w:val="26"/>
           <w:lang w:val="vi-VN"/>
         </w:rPr>
         <w:t>cụ</w:t>
@@ -3974,8 +3716,7 @@
           <w:rFonts w:ascii="Times New Roman" w:hAnsi="Times New Roman"/>
           <w:i/>
           <w:spacing w:val="-3"/>
-          <w:sz w:val="26"/>
-          <w:szCs w:val="28"/>
+          <w:szCs w:val="26"/>
           <w:lang w:val="vi-VN"/>
         </w:rPr>
         <w:t xml:space="preserve"> </w:t>
@@ -3984,26 +3725,11 @@
         <w:rPr>
           <w:rFonts w:ascii="Times New Roman" w:hAnsi="Times New Roman"/>
           <w:i/>
-          <w:sz w:val="26"/>
-          <w:szCs w:val="28"/>
+          <w:szCs w:val="26"/>
           <w:lang w:val="vi-VN"/>
         </w:rPr>
         <w:t>thể:</w:t>
       </w:r>
-    </w:p>
-    <w:p>
-      <w:pPr>
-        <w:pStyle w:val="ListParagraph"/>
-        <w:spacing w:before="120" w:line="320" w:lineRule="exact"/>
-        <w:jc w:val="both"/>
-        <w:rPr>
-          <w:rFonts w:ascii="Times New Roman" w:hAnsi="Times New Roman"/>
-          <w:i/>
-          <w:sz w:val="28"/>
-          <w:szCs w:val="28"/>
-          <w:lang w:val="en-SG"/>
-        </w:rPr>
-      </w:pPr>
     </w:p>
     <w:tbl>
       <w:tblPr>
@@ -4027,12 +3753,13 @@
             <w:pPr>
               <w:rPr>
                 <w:rFonts w:ascii="Times New Roman" w:hAnsi="Times New Roman"/>
+                <w:szCs w:val="26"/>
               </w:rPr>
             </w:pPr>
             <w:r>
               <w:rPr>
                 <w:rFonts w:ascii="Times New Roman" w:hAnsi="Times New Roman"/>
-                <w:sz w:val="26"/>
+                <w:szCs w:val="26"/>
               </w:rPr>
               <w:t>{{PAY_ROW}}</w:t>
             </w:r>
@@ -4040,34 +3767,6 @@
         </w:tc>
       </w:tr>
     </w:tbl>
-    <w:p>
-      <w:pPr>
-        <w:pStyle w:val="ListParagraph"/>
-        <w:spacing w:before="120" w:line="320" w:lineRule="exact"/>
-        <w:jc w:val="both"/>
-        <w:rPr>
-          <w:rFonts w:ascii="Times New Roman" w:hAnsi="Times New Roman"/>
-          <w:i/>
-          <w:sz w:val="28"/>
-          <w:szCs w:val="28"/>
-          <w:lang w:val="en-SG"/>
-        </w:rPr>
-      </w:pPr>
-    </w:p>
-    <w:p>
-      <w:pPr>
-        <w:pStyle w:val="ListParagraph"/>
-        <w:spacing w:before="120" w:line="320" w:lineRule="exact"/>
-        <w:jc w:val="both"/>
-        <w:rPr>
-          <w:rFonts w:ascii="Times New Roman" w:hAnsi="Times New Roman"/>
-          <w:i/>
-          <w:sz w:val="28"/>
-          <w:szCs w:val="28"/>
-          <w:lang w:val="en-SG"/>
-        </w:rPr>
-      </w:pPr>
-    </w:p>
     <w:p>
       <w:pPr>
         <w:pStyle w:val="ListParagraph"/>
@@ -4079,14 +3778,13 @@
         <w:jc w:val="both"/>
         <w:rPr>
           <w:rFonts w:ascii="Times New Roman" w:hAnsi="Times New Roman"/>
-          <w:sz w:val="28"/>
-          <w:szCs w:val="28"/>
-        </w:rPr>
-      </w:pPr>
-      <w:r>
-        <w:rPr>
-          <w:rFonts w:ascii="Times New Roman" w:hAnsi="Times New Roman"/>
-          <w:sz w:val="26"/>
+          <w:szCs w:val="26"/>
+        </w:rPr>
+      </w:pPr>
+      <w:r>
+        <w:rPr>
+          <w:rFonts w:ascii="Times New Roman" w:hAnsi="Times New Roman"/>
+          <w:szCs w:val="26"/>
         </w:rPr>
         <w:t>Các điều khoản và điều kiện khác trong hợp đồng số {{CONTRACT_NO}} ký ngày {{CONTRACT_DATE}} không có gì thay đổi; các điều khoản cùng nội dung được thay thế bằng nội dung trong phụ lục này.</w:t>
       </w:r>
@@ -4102,14 +3800,13 @@
         <w:jc w:val="both"/>
         <w:rPr>
           <w:rFonts w:ascii="Times New Roman" w:hAnsi="Times New Roman"/>
-          <w:sz w:val="28"/>
-          <w:szCs w:val="28"/>
-        </w:rPr>
-      </w:pPr>
-      <w:r>
-        <w:rPr>
-          <w:rFonts w:ascii="Times New Roman" w:hAnsi="Times New Roman"/>
-          <w:sz w:val="26"/>
+          <w:szCs w:val="26"/>
+        </w:rPr>
+      </w:pPr>
+      <w:r>
+        <w:rPr>
+          <w:rFonts w:ascii="Times New Roman" w:hAnsi="Times New Roman"/>
+          <w:szCs w:val="26"/>
         </w:rPr>
         <w:t>Phụ lục này có hiệu lực từ ngày ký và là một phần không thể tách rời của hợp đồng số {{CONTRACT_NO}} ký ngày {{CONTRACT_DATE}}.</w:t>
       </w:r>
@@ -4125,30 +3822,16 @@
         <w:jc w:val="both"/>
         <w:rPr>
           <w:rFonts w:ascii="Times New Roman" w:hAnsi="Times New Roman"/>
-          <w:sz w:val="28"/>
-          <w:szCs w:val="28"/>
-        </w:rPr>
-      </w:pPr>
-      <w:r>
-        <w:rPr>
-          <w:rFonts w:ascii="Times New Roman" w:hAnsi="Times New Roman"/>
-          <w:sz w:val="26"/>
-          <w:szCs w:val="28"/>
+          <w:szCs w:val="26"/>
+        </w:rPr>
+      </w:pPr>
+      <w:r>
+        <w:rPr>
+          <w:rFonts w:ascii="Times New Roman" w:hAnsi="Times New Roman"/>
+          <w:szCs w:val="26"/>
         </w:rPr>
         <w:t>Phụ lục hợp đồng này được lập thành 05 bản (năm bản), bên A giữ 02 bản, bên B giữ 03 bản và có giá trị pháp lý như nhau.</w:t>
       </w:r>
-    </w:p>
-    <w:p>
-      <w:pPr>
-        <w:pStyle w:val="ListParagraph"/>
-        <w:spacing w:before="120" w:line="320" w:lineRule="exact"/>
-        <w:jc w:val="both"/>
-        <w:rPr>
-          <w:rFonts w:ascii="Times New Roman" w:hAnsi="Times New Roman"/>
-          <w:sz w:val="28"/>
-          <w:szCs w:val="28"/>
-        </w:rPr>
-      </w:pPr>
     </w:p>
     <w:tbl>
       <w:tblPr>
@@ -4177,16 +3860,14 @@
               <w:rPr>
                 <w:rFonts w:ascii="Times New Roman" w:hAnsi="Times New Roman"/>
                 <w:b/>
-                <w:sz w:val="28"/>
-                <w:szCs w:val="28"/>
+                <w:szCs w:val="26"/>
               </w:rPr>
             </w:pPr>
             <w:r>
               <w:rPr>
                 <w:rFonts w:ascii="Times New Roman" w:hAnsi="Times New Roman"/>
                 <w:b/>
-                <w:sz w:val="26"/>
-                <w:szCs w:val="28"/>
+                <w:szCs w:val="26"/>
               </w:rPr>
               <w:t>ĐẠI DIỆN BÊN A</w:t>
             </w:r>
@@ -4197,17 +3878,15 @@
               <w:spacing w:before="120" w:line="320" w:lineRule="exact"/>
               <w:rPr>
                 <w:rFonts w:ascii="Times New Roman" w:hAnsi="Times New Roman"/>
-                <w:sz w:val="28"/>
-                <w:szCs w:val="28"/>
+                <w:szCs w:val="26"/>
               </w:rPr>
             </w:pPr>
             <w:r>
               <w:rPr>
                 <w:rFonts w:ascii="Times New Roman" w:hAnsi="Times New Roman"/>
-                <w:sz w:val="26"/>
-                <w:szCs w:val="28"/>
-              </w:rPr>
-              <w:t xml:space="preserve">                 </w:t>
+                <w:szCs w:val="26"/>
+              </w:rPr>
+              <w:t xml:space="preserve"> </w:t>
             </w:r>
           </w:p>
           <w:p>
@@ -4216,8 +3895,7 @@
               <w:ind w:left="360"/>
               <w:rPr>
                 <w:rFonts w:ascii="Times New Roman" w:hAnsi="Times New Roman"/>
-                <w:sz w:val="28"/>
-                <w:szCs w:val="28"/>
+                <w:szCs w:val="26"/>
               </w:rPr>
             </w:pPr>
           </w:p>
@@ -4227,8 +3905,7 @@
               <w:ind w:left="360"/>
               <w:rPr>
                 <w:rFonts w:ascii="Times New Roman" w:hAnsi="Times New Roman"/>
-                <w:sz w:val="28"/>
-                <w:szCs w:val="28"/>
+                <w:szCs w:val="26"/>
               </w:rPr>
             </w:pPr>
           </w:p>
@@ -4244,18 +3921,15 @@
               <w:rPr>
                 <w:rFonts w:ascii="Times New Roman" w:hAnsi="Times New Roman"/>
                 <w:b/>
-                <w:sz w:val="28"/>
-                <w:szCs w:val="28"/>
+                <w:szCs w:val="26"/>
               </w:rPr>
             </w:pPr>
             <w:r>
               <w:rPr>
                 <w:rFonts w:ascii="Times New Roman" w:hAnsi="Times New Roman"/>
                 <w:b/>
-                <w:sz w:val="26"/>
-                <w:szCs w:val="28"/>
-              </w:rPr>
-              <w:lastRenderedPageBreak/>
+                <w:szCs w:val="26"/>
+              </w:rPr>
               <w:t>ĐẠI DIỆN BÊN B</w:t>
             </w:r>
           </w:p>
@@ -4265,16 +3939,14 @@
               <w:jc w:val="center"/>
               <w:rPr>
                 <w:rFonts w:ascii="Times New Roman" w:hAnsi="Times New Roman"/>
-                <w:sz w:val="28"/>
-                <w:szCs w:val="28"/>
+                <w:szCs w:val="26"/>
               </w:rPr>
             </w:pPr>
             <w:r>
               <w:rPr>
                 <w:rFonts w:ascii="Times New Roman" w:hAnsi="Times New Roman"/>
                 <w:b/>
-                <w:sz w:val="26"/>
-                <w:szCs w:val="28"/>
+                <w:szCs w:val="26"/>
               </w:rPr>
               <w:t>PHÓ GIÁM ĐỐC</w:t>
             </w:r>
@@ -4287,8 +3959,7 @@
               <w:spacing w:before="120" w:line="320" w:lineRule="exact"/>
               <w:rPr>
                 <w:rFonts w:ascii="Times New Roman" w:hAnsi="Times New Roman"/>
-                <w:sz w:val="28"/>
-                <w:szCs w:val="28"/>
+                <w:szCs w:val="26"/>
               </w:rPr>
             </w:pPr>
           </w:p>
@@ -4309,8 +3980,7 @@
               <w:rPr>
                 <w:rFonts w:ascii="Times New Roman" w:hAnsi="Times New Roman"/>
                 <w:b/>
-                <w:sz w:val="28"/>
-                <w:szCs w:val="28"/>
+                <w:szCs w:val="26"/>
               </w:rPr>
             </w:pPr>
           </w:p>
@@ -4326,8 +3996,7 @@
               <w:rPr>
                 <w:rFonts w:ascii="Times New Roman" w:hAnsi="Times New Roman"/>
                 <w:b/>
-                <w:sz w:val="28"/>
-                <w:szCs w:val="28"/>
+                <w:szCs w:val="26"/>
               </w:rPr>
             </w:pPr>
           </w:p>
@@ -4338,8 +4007,7 @@
               <w:rPr>
                 <w:rFonts w:ascii="Times New Roman" w:hAnsi="Times New Roman"/>
                 <w:b/>
-                <w:sz w:val="28"/>
-                <w:szCs w:val="28"/>
+                <w:szCs w:val="26"/>
               </w:rPr>
             </w:pPr>
           </w:p>
@@ -4350,8 +4018,7 @@
               <w:rPr>
                 <w:rFonts w:ascii="Times New Roman" w:hAnsi="Times New Roman"/>
                 <w:b/>
-                <w:sz w:val="28"/>
-                <w:szCs w:val="28"/>
+                <w:szCs w:val="26"/>
               </w:rPr>
             </w:pPr>
           </w:p>
@@ -4375,15 +4042,14 @@
                 <w:bCs/>
                 <w:i/>
                 <w:iCs/>
-                <w:sz w:val="28"/>
-                <w:szCs w:val="28"/>
+                <w:szCs w:val="26"/>
               </w:rPr>
             </w:pPr>
             <w:r>
               <w:rPr>
                 <w:rFonts w:ascii="Times New Roman" w:hAnsi="Times New Roman"/>
                 <w:b/>
-                <w:sz w:val="26"/>
+                <w:szCs w:val="26"/>
               </w:rPr>
               <w:t>{{OWNER_NAME}}</w:t>
             </w:r>
@@ -4401,8 +4067,7 @@
                 <w:rFonts w:ascii="Times New Roman" w:hAnsi="Times New Roman"/>
                 <w:b/>
                 <w:bCs/>
-                <w:sz w:val="28"/>
-                <w:szCs w:val="28"/>
+                <w:szCs w:val="26"/>
               </w:rPr>
             </w:pPr>
             <w:r>
@@ -4411,8 +4076,7 @@
                 <w:b/>
                 <w:bCs/>
                 <w:iCs/>
-                <w:sz w:val="26"/>
-                <w:szCs w:val="28"/>
+                <w:szCs w:val="26"/>
               </w:rPr>
               <w:t>Nguyễn Thanh Lâm</w:t>
             </w:r>
@@ -4423,8 +4087,7 @@
               <w:jc w:val="center"/>
               <w:rPr>
                 <w:rFonts w:ascii="Times New Roman" w:hAnsi="Times New Roman"/>
-                <w:sz w:val="28"/>
-                <w:szCs w:val="28"/>
+                <w:szCs w:val="26"/>
               </w:rPr>
             </w:pPr>
           </w:p>
@@ -4434,7 +4097,7 @@
     <w:p/>
     <w:sectPr>
       <w:pgSz w:w="11906" w:h="16838"/>
-      <w:pgMar w:top="990" w:right="1440" w:bottom="1440" w:left="1440" w:header="708" w:footer="708" w:gutter="0"/>
+      <w:pgMar w:top="720" w:right="1440" w:bottom="1440" w:left="1440" w:header="708" w:footer="708" w:gutter="0"/>
       <w:cols w:space="708"/>
       <w:docGrid w:linePitch="360"/>
     </w:sectPr>
@@ -4443,7 +4106,7 @@
 </file>
 
 <file path=word/numbering.xml><?xml version="1.0" encoding="utf-8"?>
-<w:numbering xmlns:wpc="http://schemas.microsoft.com/office/word/2010/wordprocessingCanvas" xmlns:cx="http://schemas.microsoft.com/office/drawing/2014/chartex" xmlns:cx1="http://schemas.microsoft.com/office/drawing/2015/9/8/chartex" xmlns:cx2="http://schemas.microsoft.com/office/drawing/2015/10/21/chartex" xmlns:cx3="http://schemas.microsoft.com/office/drawing/2016/5/9/chartex" xmlns:cx4="http://schemas.microsoft.com/office/drawing/2016/5/10/chartex" xmlns:cx5="http://schemas.microsoft.com/office/drawing/2016/5/11/chartex" xmlns:cx6="http://schemas.microsoft.com/office/drawing/2016/5/12/chartex" xmlns:cx7="http://schemas.microsoft.com/office/drawing/2016/5/13/chartex" xmlns:cx8="http://schemas.microsoft.com/office/drawing/2016/5/14/chartex" xmlns:mc="http://schemas.openxmlformats.org/markup-compatibility/2006" xmlns:aink="http://schemas.microsoft.com/office/drawing/2016/ink" xmlns:am3d="http://schemas.microsoft.com/office/drawing/2017/model3d" xmlns:o="urn:schemas-microsoft-com:office:office" xmlns:r="http://schemas.openxmlformats.org/officeDocument/2006/relationships" xmlns:m="http://schemas.openxmlformats.org/officeDocument/2006/math" xmlns:v="urn:schemas-microsoft-com:vml" xmlns:wp14="http://schemas.microsoft.com/office/word/2010/wordprocessingDrawing" xmlns:wp="http://schemas.openxmlformats.org/drawingml/2006/wordprocessingDrawing" xmlns:w10="urn:schemas-microsoft-com:office:word" xmlns:w="http://schemas.openxmlformats.org/wordprocessingml/2006/main" xmlns:w14="http://schemas.microsoft.com/office/word/2010/wordml" xmlns:w15="http://schemas.microsoft.com/office/word/2012/wordml" xmlns:w16cid="http://schemas.microsoft.com/office/word/2016/wordml/cid" xmlns:w16se="http://schemas.microsoft.com/office/word/2015/wordml/symex" xmlns:wpg="http://schemas.microsoft.com/office/word/2010/wordprocessingGroup" xmlns:wpi="http://schemas.microsoft.com/office/word/2010/wordprocessingInk" xmlns:wne="http://schemas.microsoft.com/office/word/2006/wordml" xmlns:wps="http://schemas.microsoft.com/office/word/2010/wordprocessingShape" mc:Ignorable="w14 w15 w16se w16cid wp14">
+<w:numbering xmlns:wpc="http://schemas.microsoft.com/office/word/2010/wordprocessingCanvas" xmlns:cx="http://schemas.microsoft.com/office/drawing/2014/chartex" xmlns:cx1="http://schemas.microsoft.com/office/drawing/2015/9/8/chartex" xmlns:cx2="http://schemas.microsoft.com/office/drawing/2015/10/21/chartex" xmlns:cx3="http://schemas.microsoft.com/office/drawing/2016/5/9/chartex" xmlns:cx4="http://schemas.microsoft.com/office/drawing/2016/5/10/chartex" xmlns:cx5="http://schemas.microsoft.com/office/drawing/2016/5/11/chartex" xmlns:cx6="http://schemas.microsoft.com/office/drawing/2016/5/12/chartex" xmlns:cx7="http://schemas.microsoft.com/office/drawing/2016/5/13/chartex" xmlns:cx8="http://schemas.microsoft.com/office/drawing/2016/5/14/chartex" xmlns:mc="http://schemas.openxmlformats.org/markup-compatibility/2006" xmlns:aink="http://schemas.microsoft.com/office/drawing/2016/ink" xmlns:am3d="http://schemas.microsoft.com/office/drawing/2017/model3d" xmlns:o="urn:schemas-microsoft-com:office:office" xmlns:oel="http://schemas.microsoft.com/office/2019/extlst" xmlns:r="http://schemas.openxmlformats.org/officeDocument/2006/relationships" xmlns:m="http://schemas.openxmlformats.org/officeDocument/2006/math" xmlns:v="urn:schemas-microsoft-com:vml" xmlns:wp14="http://schemas.microsoft.com/office/word/2010/wordprocessingDrawing" xmlns:wp="http://schemas.openxmlformats.org/drawingml/2006/wordprocessingDrawing" xmlns:w10="urn:schemas-microsoft-com:office:word" xmlns:w="http://schemas.openxmlformats.org/wordprocessingml/2006/main" xmlns:w14="http://schemas.microsoft.com/office/word/2010/wordml" xmlns:w15="http://schemas.microsoft.com/office/word/2012/wordml" xmlns:w16cex="http://schemas.microsoft.com/office/word/2018/wordml/cex" xmlns:w16cid="http://schemas.microsoft.com/office/word/2016/wordml/cid" xmlns:w16="http://schemas.microsoft.com/office/word/2018/wordml" xmlns:w16du="http://schemas.microsoft.com/office/word/2023/wordml/word16du" xmlns:w16sdtdh="http://schemas.microsoft.com/office/word/2020/wordml/sdtdatahash" xmlns:w16sdtfl="http://schemas.microsoft.com/office/word/2024/wordml/sdtformatlock" xmlns:w16se="http://schemas.microsoft.com/office/word/2015/wordml/symex" xmlns:wpg="http://schemas.microsoft.com/office/word/2010/wordprocessingGroup" xmlns:wpi="http://schemas.microsoft.com/office/word/2010/wordprocessingInk" xmlns:wne="http://schemas.microsoft.com/office/word/2006/wordml" xmlns:wps="http://schemas.microsoft.com/office/word/2010/wordprocessingShape" mc:Ignorable="w14 w15 w16se w16cid w16 w16cex w16sdtdh w16sdtfl w16du wp14">
   <w:abstractNum w:abstractNumId="0" w15:restartNumberingAfterBreak="1">
     <w:nsid w:val="084E5937"/>
     <w:multiLevelType w:val="hybridMultilevel"/>
@@ -5627,44 +5290,44 @@
       </w:pPr>
     </w:lvl>
   </w:abstractNum>
-  <w:num w:numId="1">
+  <w:num w:numId="1" w16cid:durableId="2111850298">
     <w:abstractNumId w:val="5"/>
   </w:num>
-  <w:num w:numId="2">
+  <w:num w:numId="2" w16cid:durableId="209999525">
     <w:abstractNumId w:val="3"/>
   </w:num>
-  <w:num w:numId="3">
+  <w:num w:numId="3" w16cid:durableId="91897000">
     <w:abstractNumId w:val="6"/>
   </w:num>
-  <w:num w:numId="4">
+  <w:num w:numId="4" w16cid:durableId="870337587">
     <w:abstractNumId w:val="7"/>
   </w:num>
-  <w:num w:numId="5">
+  <w:num w:numId="5" w16cid:durableId="1027099605">
     <w:abstractNumId w:val="4"/>
   </w:num>
-  <w:num w:numId="6">
+  <w:num w:numId="6" w16cid:durableId="2029022730">
     <w:abstractNumId w:val="9"/>
   </w:num>
-  <w:num w:numId="7">
+  <w:num w:numId="7" w16cid:durableId="412974068">
     <w:abstractNumId w:val="0"/>
   </w:num>
-  <w:num w:numId="8">
+  <w:num w:numId="8" w16cid:durableId="1361321948">
     <w:abstractNumId w:val="2"/>
   </w:num>
-  <w:num w:numId="9">
+  <w:num w:numId="9" w16cid:durableId="1837527622">
     <w:abstractNumId w:val="1"/>
   </w:num>
-  <w:num w:numId="10">
+  <w:num w:numId="10" w16cid:durableId="255293006">
     <w:abstractNumId w:val="10"/>
   </w:num>
-  <w:num w:numId="11">
+  <w:num w:numId="11" w16cid:durableId="806355466">
     <w:abstractNumId w:val="8"/>
   </w:num>
 </w:numbering>
 </file>
 
 <file path=word/styles.xml><?xml version="1.0" encoding="utf-8"?>
-<w:styles xmlns:mc="http://schemas.openxmlformats.org/markup-compatibility/2006" xmlns:r="http://schemas.openxmlformats.org/officeDocument/2006/relationships" xmlns:w="http://schemas.openxmlformats.org/wordprocessingml/2006/main" xmlns:w14="http://schemas.microsoft.com/office/word/2010/wordml" xmlns:w15="http://schemas.microsoft.com/office/word/2012/wordml" xmlns:w16cid="http://schemas.microsoft.com/office/word/2016/wordml/cid" xmlns:w16se="http://schemas.microsoft.com/office/word/2015/wordml/symex" mc:Ignorable="w14 w15 w16se w16cid">
+<w:styles xmlns:mc="http://schemas.openxmlformats.org/markup-compatibility/2006" xmlns:r="http://schemas.openxmlformats.org/officeDocument/2006/relationships" xmlns:w="http://schemas.openxmlformats.org/wordprocessingml/2006/main" xmlns:w14="http://schemas.microsoft.com/office/word/2010/wordml" xmlns:w15="http://schemas.microsoft.com/office/word/2012/wordml" xmlns:w16cex="http://schemas.microsoft.com/office/word/2018/wordml/cex" xmlns:w16cid="http://schemas.microsoft.com/office/word/2016/wordml/cid" xmlns:w16="http://schemas.microsoft.com/office/word/2018/wordml" xmlns:w16du="http://schemas.microsoft.com/office/word/2023/wordml/word16du" xmlns:w16sdtdh="http://schemas.microsoft.com/office/word/2020/wordml/sdtdatahash" xmlns:w16sdtfl="http://schemas.microsoft.com/office/word/2024/wordml/sdtformatlock" xmlns:w16se="http://schemas.microsoft.com/office/word/2015/wordml/symex" mc:Ignorable="w14 w15 w16se w16cid w16 w16cex w16sdtdh w16sdtfl w16du">
   <w:docDefaults>
     <w:rPrDefault>
       <w:rPr>
@@ -5682,7 +5345,7 @@
       </w:pPr>
     </w:pPrDefault>
   </w:docDefaults>
-  <w:latentStyles w:defLockedState="0" w:defUIPriority="99" w:defSemiHidden="0" w:defUnhideWhenUsed="0" w:defQFormat="0" w:count="375">
+  <w:latentStyles w:defLockedState="0" w:defUIPriority="99" w:defSemiHidden="0" w:defUnhideWhenUsed="0" w:defQFormat="0" w:count="376">
     <w:lsdException w:name="Normal" w:uiPriority="0" w:qFormat="1"/>
     <w:lsdException w:name="heading 1" w:uiPriority="9" w:qFormat="1"/>
     <w:lsdException w:name="heading 2" w:semiHidden="1" w:uiPriority="9" w:unhideWhenUsed="1" w:qFormat="1"/>
@@ -6058,11 +5721,12 @@
     <w:lsdException w:name="Smart Hyperlink" w:semiHidden="1" w:unhideWhenUsed="1"/>
     <w:lsdException w:name="Hashtag" w:semiHidden="1" w:unhideWhenUsed="1"/>
     <w:lsdException w:name="Unresolved Mention" w:semiHidden="1" w:unhideWhenUsed="1"/>
+    <w:lsdException w:name="Smart Link" w:semiHidden="1" w:unhideWhenUsed="1"/>
   </w:latentStyles>
   <w:style w:type="paragraph" w:default="1" w:styleId="Normal">
     <w:name w:val="Normal"/>
     <w:qFormat/>
-    <w:rsid w:val="001E0231"/>
+    <w:rsid w:val="006D77CE"/>
     <w:pPr>
       <w:spacing w:after="0" w:line="240" w:lineRule="auto"/>
     </w:pPr>

</xml_diff>